<commit_message>
added address in docs editor for all pending inc docs
</commit_message>
<xml_diff>
--- a/public/docs/NGPA_Contract-Form.docx
+++ b/public/docs/NGPA_Contract-Form.docx
@@ -231,7 +231,7 @@
           <w:i/>
           <w:iCs/>
         </w:rPr>
-        <w:t>[Name of Procuring Entity]</w:t>
+        <w:t>{{entity_name}}</w:t>
       </w:r>
       <w:r>
         <w:rPr/>
@@ -1493,7 +1493,7 @@
           <w:i/>
           <w:iCs/>
         </w:rPr>
-        <w:t>[Name of the Procuring Entity]</w:t>
+        <w:t>{{entity_name}}</w:t>
       </w:r>
       <w:r>
         <w:rPr/>
@@ -1943,7 +1943,280 @@
                 <w:szCs w:val="22"/>
                 <w:lang w:val="en-PH" w:eastAsia="en-US" w:bidi="ar-SA"/>
               </w:rPr>
-              <w:t>[Bidders Name]</w:t>
+              <w:t>{</w:t>
+            </w:r>
+            <w:r>
+              <w:rPr>
+                <w:rFonts w:eastAsia="Arial" w:cs="Arial" w:ascii="Arial" w:hAnsi="Arial"/>
+                <w:i/>
+                <w:iCs/>
+                <w:color w:themeColor="text1" w:val="000000"/>
+                <w:kern w:val="0"/>
+                <w:sz w:val="22"/>
+                <w:szCs w:val="22"/>
+                <w:lang w:val="en-PH" w:eastAsia="en-US" w:bidi="ar-SA"/>
+              </w:rPr>
+              <w:t>{</w:t>
+            </w:r>
+            <w:r>
+              <w:rPr>
+                <w:rFonts w:eastAsia="Arial" w:cs="Arial" w:ascii="Arial" w:hAnsi="Arial"/>
+                <w:i/>
+                <w:iCs/>
+                <w:color w:themeColor="text1" w:val="000000"/>
+                <w:kern w:val="0"/>
+                <w:sz w:val="22"/>
+                <w:szCs w:val="22"/>
+                <w:lang w:val="en-PH" w:eastAsia="en-US" w:bidi="ar-SA"/>
+              </w:rPr>
+              <w:t>c</w:t>
+            </w:r>
+            <w:r>
+              <w:rPr>
+                <w:rFonts w:eastAsia="Arial" w:cs="Arial" w:ascii="Arial" w:hAnsi="Arial"/>
+                <w:i/>
+                <w:iCs/>
+                <w:color w:themeColor="text1" w:val="000000"/>
+                <w:kern w:val="0"/>
+                <w:sz w:val="22"/>
+                <w:szCs w:val="22"/>
+                <w:lang w:val="en-PH" w:eastAsia="en-US" w:bidi="ar-SA"/>
+              </w:rPr>
+              <w:t>o</w:t>
+            </w:r>
+            <w:r>
+              <w:rPr>
+                <w:rFonts w:eastAsia="Arial" w:cs="Arial" w:ascii="Arial" w:hAnsi="Arial"/>
+                <w:i/>
+                <w:iCs/>
+                <w:color w:themeColor="text1" w:val="000000"/>
+                <w:kern w:val="0"/>
+                <w:sz w:val="22"/>
+                <w:szCs w:val="22"/>
+                <w:lang w:val="en-PH" w:eastAsia="en-US" w:bidi="ar-SA"/>
+              </w:rPr>
+              <w:t>m</w:t>
+            </w:r>
+            <w:r>
+              <w:rPr>
+                <w:rFonts w:eastAsia="Arial" w:cs="Arial" w:ascii="Arial" w:hAnsi="Arial"/>
+                <w:i/>
+                <w:iCs/>
+                <w:color w:themeColor="text1" w:val="000000"/>
+                <w:kern w:val="0"/>
+                <w:sz w:val="22"/>
+                <w:szCs w:val="22"/>
+                <w:lang w:val="en-PH" w:eastAsia="en-US" w:bidi="ar-SA"/>
+              </w:rPr>
+              <w:t>p</w:t>
+            </w:r>
+            <w:r>
+              <w:rPr>
+                <w:rFonts w:eastAsia="Arial" w:cs="Arial" w:ascii="Arial" w:hAnsi="Arial"/>
+                <w:i/>
+                <w:iCs/>
+                <w:color w:themeColor="text1" w:val="000000"/>
+                <w:kern w:val="0"/>
+                <w:sz w:val="22"/>
+                <w:szCs w:val="22"/>
+                <w:lang w:val="en-PH" w:eastAsia="en-US" w:bidi="ar-SA"/>
+              </w:rPr>
+              <w:t>a</w:t>
+            </w:r>
+            <w:r>
+              <w:rPr>
+                <w:rFonts w:eastAsia="Arial" w:cs="Arial" w:ascii="Arial" w:hAnsi="Arial"/>
+                <w:i/>
+                <w:iCs/>
+                <w:color w:themeColor="text1" w:val="000000"/>
+                <w:kern w:val="0"/>
+                <w:sz w:val="22"/>
+                <w:szCs w:val="22"/>
+                <w:lang w:val="en-PH" w:eastAsia="en-US" w:bidi="ar-SA"/>
+              </w:rPr>
+              <w:t>n</w:t>
+            </w:r>
+            <w:r>
+              <w:rPr>
+                <w:rFonts w:eastAsia="Arial" w:cs="Arial" w:ascii="Arial" w:hAnsi="Arial"/>
+                <w:i/>
+                <w:iCs/>
+                <w:color w:themeColor="text1" w:val="000000"/>
+                <w:kern w:val="0"/>
+                <w:sz w:val="22"/>
+                <w:szCs w:val="22"/>
+                <w:lang w:val="en-PH" w:eastAsia="en-US" w:bidi="ar-SA"/>
+              </w:rPr>
+              <w:t>y</w:t>
+            </w:r>
+            <w:r>
+              <w:rPr>
+                <w:rFonts w:eastAsia="Arial" w:cs="Arial" w:ascii="Arial" w:hAnsi="Arial"/>
+                <w:i/>
+                <w:iCs/>
+                <w:color w:themeColor="text1" w:val="000000"/>
+                <w:kern w:val="0"/>
+                <w:sz w:val="22"/>
+                <w:szCs w:val="22"/>
+                <w:lang w:val="en-PH" w:eastAsia="en-US" w:bidi="ar-SA"/>
+              </w:rPr>
+              <w:t>_</w:t>
+            </w:r>
+            <w:r>
+              <w:rPr>
+                <w:rFonts w:eastAsia="Arial" w:cs="Arial" w:ascii="Arial" w:hAnsi="Arial"/>
+                <w:i/>
+                <w:iCs/>
+                <w:color w:themeColor="text1" w:val="000000"/>
+                <w:kern w:val="0"/>
+                <w:sz w:val="22"/>
+                <w:szCs w:val="22"/>
+                <w:lang w:val="en-PH" w:eastAsia="en-US" w:bidi="ar-SA"/>
+              </w:rPr>
+              <w:t>n</w:t>
+            </w:r>
+            <w:r>
+              <w:rPr>
+                <w:rFonts w:eastAsia="Arial" w:cs="Arial" w:ascii="Arial" w:hAnsi="Arial"/>
+                <w:i/>
+                <w:iCs/>
+                <w:color w:themeColor="text1" w:val="000000"/>
+                <w:kern w:val="0"/>
+                <w:sz w:val="22"/>
+                <w:szCs w:val="22"/>
+                <w:lang w:val="en-PH" w:eastAsia="en-US" w:bidi="ar-SA"/>
+              </w:rPr>
+              <w:t>a</w:t>
+            </w:r>
+            <w:r>
+              <w:rPr>
+                <w:rFonts w:eastAsia="Arial" w:cs="Arial" w:ascii="Arial" w:hAnsi="Arial"/>
+                <w:i/>
+                <w:iCs/>
+                <w:color w:themeColor="text1" w:val="000000"/>
+                <w:kern w:val="0"/>
+                <w:sz w:val="22"/>
+                <w:szCs w:val="22"/>
+                <w:lang w:val="en-PH" w:eastAsia="en-US" w:bidi="ar-SA"/>
+              </w:rPr>
+              <w:t>m</w:t>
+            </w:r>
+            <w:r>
+              <w:rPr>
+                <w:rFonts w:eastAsia="Arial" w:cs="Arial" w:ascii="Arial" w:hAnsi="Arial"/>
+                <w:i/>
+                <w:iCs/>
+                <w:color w:themeColor="text1" w:val="000000"/>
+                <w:kern w:val="0"/>
+                <w:sz w:val="22"/>
+                <w:szCs w:val="22"/>
+                <w:lang w:val="en-PH" w:eastAsia="en-US" w:bidi="ar-SA"/>
+              </w:rPr>
+              <w:t>e</w:t>
+            </w:r>
+            <w:r>
+              <w:rPr>
+                <w:rFonts w:eastAsia="Arial" w:cs="Arial" w:ascii="Arial" w:hAnsi="Arial"/>
+                <w:i/>
+                <w:iCs/>
+                <w:color w:themeColor="text1" w:val="000000"/>
+                <w:kern w:val="0"/>
+                <w:sz w:val="22"/>
+                <w:szCs w:val="22"/>
+                <w:lang w:val="en-PH" w:eastAsia="en-US" w:bidi="ar-SA"/>
+              </w:rPr>
+              <w:t>_</w:t>
+            </w:r>
+            <w:r>
+              <w:rPr>
+                <w:rFonts w:eastAsia="Arial" w:cs="Arial" w:ascii="Arial" w:hAnsi="Arial"/>
+                <w:i/>
+                <w:iCs/>
+                <w:color w:themeColor="text1" w:val="000000"/>
+                <w:kern w:val="0"/>
+                <w:sz w:val="22"/>
+                <w:szCs w:val="22"/>
+                <w:lang w:val="en-PH" w:eastAsia="en-US" w:bidi="ar-SA"/>
+              </w:rPr>
+              <w:t>u</w:t>
+            </w:r>
+            <w:r>
+              <w:rPr>
+                <w:rFonts w:eastAsia="Arial" w:cs="Arial" w:ascii="Arial" w:hAnsi="Arial"/>
+                <w:i/>
+                <w:iCs/>
+                <w:color w:themeColor="text1" w:val="000000"/>
+                <w:kern w:val="0"/>
+                <w:sz w:val="22"/>
+                <w:szCs w:val="22"/>
+                <w:lang w:val="en-PH" w:eastAsia="en-US" w:bidi="ar-SA"/>
+              </w:rPr>
+              <w:t>p</w:t>
+            </w:r>
+            <w:r>
+              <w:rPr>
+                <w:rFonts w:eastAsia="Arial" w:cs="Arial" w:ascii="Arial" w:hAnsi="Arial"/>
+                <w:i/>
+                <w:iCs/>
+                <w:color w:themeColor="text1" w:val="000000"/>
+                <w:kern w:val="0"/>
+                <w:sz w:val="22"/>
+                <w:szCs w:val="22"/>
+                <w:lang w:val="en-PH" w:eastAsia="en-US" w:bidi="ar-SA"/>
+              </w:rPr>
+              <w:t>p</w:t>
+            </w:r>
+            <w:r>
+              <w:rPr>
+                <w:rFonts w:eastAsia="Arial" w:cs="Arial" w:ascii="Arial" w:hAnsi="Arial"/>
+                <w:i/>
+                <w:iCs/>
+                <w:color w:themeColor="text1" w:val="000000"/>
+                <w:kern w:val="0"/>
+                <w:sz w:val="22"/>
+                <w:szCs w:val="22"/>
+                <w:lang w:val="en-PH" w:eastAsia="en-US" w:bidi="ar-SA"/>
+              </w:rPr>
+              <w:t>e</w:t>
+            </w:r>
+            <w:r>
+              <w:rPr>
+                <w:rFonts w:eastAsia="Arial" w:cs="Arial" w:ascii="Arial" w:hAnsi="Arial"/>
+                <w:i/>
+                <w:iCs/>
+                <w:color w:themeColor="text1" w:val="000000"/>
+                <w:kern w:val="0"/>
+                <w:sz w:val="22"/>
+                <w:szCs w:val="22"/>
+                <w:lang w:val="en-PH" w:eastAsia="en-US" w:bidi="ar-SA"/>
+              </w:rPr>
+              <w:t>r</w:t>
+            </w:r>
+            <w:r>
+              <w:rPr>
+                <w:rFonts w:eastAsia="Arial" w:cs="Arial" w:ascii="Arial" w:hAnsi="Arial"/>
+                <w:i/>
+                <w:iCs/>
+                <w:color w:themeColor="text1" w:val="000000"/>
+                <w:kern w:val="0"/>
+                <w:sz w:val="22"/>
+                <w:szCs w:val="22"/>
+                <w:lang w:val="en-PH" w:eastAsia="en-US" w:bidi="ar-SA"/>
+              </w:rPr>
+              <w:t>}</w:t>
+            </w:r>
+            <w:r>
+              <w:rPr>
+                <w:rFonts w:eastAsia="Arial" w:cs="Arial" w:ascii="Arial" w:hAnsi="Arial"/>
+                <w:i/>
+                <w:iCs/>
+                <w:color w:themeColor="text1" w:val="000000"/>
+                <w:kern w:val="0"/>
+                <w:sz w:val="22"/>
+                <w:szCs w:val="22"/>
+                <w:lang w:val="en-PH" w:eastAsia="en-US" w:bidi="ar-SA"/>
+              </w:rPr>
+              <w:t>}</w:t>
             </w:r>
             <w:r>
               <w:rPr>

</xml_diff>

<commit_message>
clean up config templates and added placeholder in doc3
</commit_message>
<xml_diff>
--- a/public/docs/NGPA_Contract-Form.docx
+++ b/public/docs/NGPA_Contract-Form.docx
@@ -231,7 +231,21 @@
           <w:i/>
           <w:iCs/>
         </w:rPr>
-        <w:t>{{entity_name}}</w:t>
+        <w:t>{{entity_name</w:t>
+      </w:r>
+      <w:r>
+        <w:rPr>
+          <w:i/>
+          <w:iCs/>
+        </w:rPr>
+        <w:t>_upper</w:t>
+      </w:r>
+      <w:r>
+        <w:rPr>
+          <w:i/>
+          <w:iCs/>
+        </w:rPr>
+        <w:t>}}</w:t>
       </w:r>
       <w:r>
         <w:rPr/>
@@ -1493,7 +1507,21 @@
           <w:i/>
           <w:iCs/>
         </w:rPr>
-        <w:t>{{entity_name}}</w:t>
+        <w:t>{{entity_name</w:t>
+      </w:r>
+      <w:r>
+        <w:rPr>
+          <w:i/>
+          <w:iCs/>
+        </w:rPr>
+        <w:t>_upper</w:t>
+      </w:r>
+      <w:r>
+        <w:rPr>
+          <w:i/>
+          <w:iCs/>
+        </w:rPr>
+        <w:t>}}</w:t>
       </w:r>
       <w:r>
         <w:rPr/>
@@ -1824,7 +1852,31 @@
                 <w:szCs w:val="22"/>
                 <w:lang w:val="en-PH" w:bidi="ar-SA"/>
               </w:rPr>
-              <w:t>[Signature over Printed Name]</w:t>
+              <w:t>{{entity_name</w:t>
+            </w:r>
+            <w:r>
+              <w:rPr>
+                <w:i/>
+                <w:iCs/>
+                <w:color w:themeColor="text1" w:val="000000"/>
+                <w:kern w:val="0"/>
+                <w:sz w:val="22"/>
+                <w:szCs w:val="22"/>
+                <w:lang w:val="en-PH" w:bidi="ar-SA"/>
+              </w:rPr>
+              <w:t>_upper</w:t>
+            </w:r>
+            <w:r>
+              <w:rPr>
+                <w:i/>
+                <w:iCs/>
+                <w:color w:themeColor="text1" w:val="000000"/>
+                <w:kern w:val="0"/>
+                <w:sz w:val="22"/>
+                <w:szCs w:val="22"/>
+                <w:lang w:val="en-PH" w:bidi="ar-SA"/>
+              </w:rPr>
+              <w:t>}}</w:t>
             </w:r>
           </w:p>
           <w:p>
@@ -1850,7 +1902,397 @@
                 <w:szCs w:val="22"/>
                 <w:lang w:val="en-PH" w:eastAsia="en-US" w:bidi="ar-SA"/>
               </w:rPr>
-              <w:t>[Position/Designation]</w:t>
+              <w:t>{</w:t>
+            </w:r>
+            <w:r>
+              <w:rPr>
+                <w:rFonts w:eastAsia="Arial" w:cs="Arial" w:ascii="Arial" w:hAnsi="Arial"/>
+                <w:i/>
+                <w:iCs/>
+                <w:color w:themeColor="text1" w:val="000000"/>
+                <w:kern w:val="0"/>
+                <w:sz w:val="22"/>
+                <w:szCs w:val="22"/>
+                <w:lang w:val="en-PH" w:eastAsia="en-US" w:bidi="ar-SA"/>
+              </w:rPr>
+              <w:t>{</w:t>
+            </w:r>
+            <w:r>
+              <w:rPr>
+                <w:rFonts w:eastAsia="Arial" w:cs="Arial" w:ascii="Arial" w:hAnsi="Arial"/>
+                <w:i/>
+                <w:iCs/>
+                <w:color w:themeColor="text1" w:val="000000"/>
+                <w:kern w:val="0"/>
+                <w:sz w:val="22"/>
+                <w:szCs w:val="22"/>
+                <w:lang w:val="en-PH" w:eastAsia="en-US" w:bidi="ar-SA"/>
+              </w:rPr>
+              <w:t>e</w:t>
+            </w:r>
+            <w:r>
+              <w:rPr>
+                <w:rFonts w:eastAsia="Arial" w:cs="Arial" w:ascii="Arial" w:hAnsi="Arial"/>
+                <w:i/>
+                <w:iCs/>
+                <w:color w:themeColor="text1" w:val="000000"/>
+                <w:kern w:val="0"/>
+                <w:sz w:val="22"/>
+                <w:szCs w:val="22"/>
+                <w:lang w:val="en-PH" w:eastAsia="en-US" w:bidi="ar-SA"/>
+              </w:rPr>
+              <w:t>n</w:t>
+            </w:r>
+            <w:r>
+              <w:rPr>
+                <w:rFonts w:eastAsia="Arial" w:cs="Arial" w:ascii="Arial" w:hAnsi="Arial"/>
+                <w:i/>
+                <w:iCs/>
+                <w:color w:themeColor="text1" w:val="000000"/>
+                <w:kern w:val="0"/>
+                <w:sz w:val="22"/>
+                <w:szCs w:val="22"/>
+                <w:lang w:val="en-PH" w:eastAsia="en-US" w:bidi="ar-SA"/>
+              </w:rPr>
+              <w:t>t</w:t>
+            </w:r>
+            <w:r>
+              <w:rPr>
+                <w:rFonts w:eastAsia="Arial" w:cs="Arial" w:ascii="Arial" w:hAnsi="Arial"/>
+                <w:i/>
+                <w:iCs/>
+                <w:color w:themeColor="text1" w:val="000000"/>
+                <w:kern w:val="0"/>
+                <w:sz w:val="22"/>
+                <w:szCs w:val="22"/>
+                <w:lang w:val="en-PH" w:eastAsia="en-US" w:bidi="ar-SA"/>
+              </w:rPr>
+              <w:t>i</w:t>
+            </w:r>
+            <w:r>
+              <w:rPr>
+                <w:rFonts w:eastAsia="Arial" w:cs="Arial" w:ascii="Arial" w:hAnsi="Arial"/>
+                <w:i/>
+                <w:iCs/>
+                <w:color w:themeColor="text1" w:val="000000"/>
+                <w:kern w:val="0"/>
+                <w:sz w:val="22"/>
+                <w:szCs w:val="22"/>
+                <w:lang w:val="en-PH" w:eastAsia="en-US" w:bidi="ar-SA"/>
+              </w:rPr>
+              <w:t>t</w:t>
+            </w:r>
+            <w:r>
+              <w:rPr>
+                <w:rFonts w:eastAsia="Arial" w:cs="Arial" w:ascii="Arial" w:hAnsi="Arial"/>
+                <w:i/>
+                <w:iCs/>
+                <w:color w:themeColor="text1" w:val="000000"/>
+                <w:kern w:val="0"/>
+                <w:sz w:val="22"/>
+                <w:szCs w:val="22"/>
+                <w:lang w:val="en-PH" w:eastAsia="en-US" w:bidi="ar-SA"/>
+              </w:rPr>
+              <w:t>y</w:t>
+            </w:r>
+            <w:r>
+              <w:rPr>
+                <w:rFonts w:eastAsia="Arial" w:cs="Arial" w:ascii="Arial" w:hAnsi="Arial"/>
+                <w:i/>
+                <w:iCs/>
+                <w:color w:themeColor="text1" w:val="000000"/>
+                <w:kern w:val="0"/>
+                <w:sz w:val="22"/>
+                <w:szCs w:val="22"/>
+                <w:lang w:val="en-PH" w:eastAsia="en-US" w:bidi="ar-SA"/>
+              </w:rPr>
+              <w:t>_</w:t>
+            </w:r>
+            <w:r>
+              <w:rPr>
+                <w:rFonts w:eastAsia="Arial" w:cs="Arial" w:ascii="Arial" w:hAnsi="Arial"/>
+                <w:i/>
+                <w:iCs/>
+                <w:color w:themeColor="text1" w:val="000000"/>
+                <w:kern w:val="0"/>
+                <w:sz w:val="22"/>
+                <w:szCs w:val="22"/>
+                <w:lang w:val="en-PH" w:eastAsia="en-US" w:bidi="ar-SA"/>
+              </w:rPr>
+              <w:t>p</w:t>
+            </w:r>
+            <w:r>
+              <w:rPr>
+                <w:rFonts w:eastAsia="Arial" w:cs="Arial" w:ascii="Arial" w:hAnsi="Arial"/>
+                <w:i/>
+                <w:iCs/>
+                <w:color w:themeColor="text1" w:val="000000"/>
+                <w:kern w:val="0"/>
+                <w:sz w:val="22"/>
+                <w:szCs w:val="22"/>
+                <w:lang w:val="en-PH" w:eastAsia="en-US" w:bidi="ar-SA"/>
+              </w:rPr>
+              <w:t>o</w:t>
+            </w:r>
+            <w:r>
+              <w:rPr>
+                <w:rFonts w:eastAsia="Arial" w:cs="Arial" w:ascii="Arial" w:hAnsi="Arial"/>
+                <w:i/>
+                <w:iCs/>
+                <w:color w:themeColor="text1" w:val="000000"/>
+                <w:kern w:val="0"/>
+                <w:sz w:val="22"/>
+                <w:szCs w:val="22"/>
+                <w:lang w:val="en-PH" w:eastAsia="en-US" w:bidi="ar-SA"/>
+              </w:rPr>
+              <w:t>s</w:t>
+            </w:r>
+            <w:r>
+              <w:rPr>
+                <w:rFonts w:eastAsia="Arial" w:cs="Arial" w:ascii="Arial" w:hAnsi="Arial"/>
+                <w:i/>
+                <w:iCs/>
+                <w:color w:themeColor="text1" w:val="000000"/>
+                <w:kern w:val="0"/>
+                <w:sz w:val="22"/>
+                <w:szCs w:val="22"/>
+                <w:lang w:val="en-PH" w:eastAsia="en-US" w:bidi="ar-SA"/>
+              </w:rPr>
+              <w:t>i</w:t>
+            </w:r>
+            <w:r>
+              <w:rPr>
+                <w:rFonts w:eastAsia="Arial" w:cs="Arial" w:ascii="Arial" w:hAnsi="Arial"/>
+                <w:i/>
+                <w:iCs/>
+                <w:color w:themeColor="text1" w:val="000000"/>
+                <w:kern w:val="0"/>
+                <w:sz w:val="22"/>
+                <w:szCs w:val="22"/>
+                <w:lang w:val="en-PH" w:eastAsia="en-US" w:bidi="ar-SA"/>
+              </w:rPr>
+              <w:t>t</w:t>
+            </w:r>
+            <w:r>
+              <w:rPr>
+                <w:rFonts w:eastAsia="Arial" w:cs="Arial" w:ascii="Arial" w:hAnsi="Arial"/>
+                <w:i/>
+                <w:iCs/>
+                <w:color w:themeColor="text1" w:val="000000"/>
+                <w:kern w:val="0"/>
+                <w:sz w:val="22"/>
+                <w:szCs w:val="22"/>
+                <w:lang w:val="en-PH" w:eastAsia="en-US" w:bidi="ar-SA"/>
+              </w:rPr>
+              <w:t>i</w:t>
+            </w:r>
+            <w:r>
+              <w:rPr>
+                <w:rFonts w:eastAsia="Arial" w:cs="Arial" w:ascii="Arial" w:hAnsi="Arial"/>
+                <w:i/>
+                <w:iCs/>
+                <w:color w:themeColor="text1" w:val="000000"/>
+                <w:kern w:val="0"/>
+                <w:sz w:val="22"/>
+                <w:szCs w:val="22"/>
+                <w:lang w:val="en-PH" w:eastAsia="en-US" w:bidi="ar-SA"/>
+              </w:rPr>
+              <w:t>o</w:t>
+            </w:r>
+            <w:r>
+              <w:rPr>
+                <w:rFonts w:eastAsia="Arial" w:cs="Arial" w:ascii="Arial" w:hAnsi="Arial"/>
+                <w:i/>
+                <w:iCs/>
+                <w:color w:themeColor="text1" w:val="000000"/>
+                <w:kern w:val="0"/>
+                <w:sz w:val="22"/>
+                <w:szCs w:val="22"/>
+                <w:lang w:val="en-PH" w:eastAsia="en-US" w:bidi="ar-SA"/>
+              </w:rPr>
+              <w:t>n</w:t>
+            </w:r>
+            <w:r>
+              <w:rPr>
+                <w:rFonts w:eastAsia="Arial" w:cs="Arial" w:ascii="Arial" w:hAnsi="Arial"/>
+                <w:i/>
+                <w:iCs/>
+                <w:color w:themeColor="text1" w:val="000000"/>
+                <w:kern w:val="0"/>
+                <w:sz w:val="22"/>
+                <w:szCs w:val="22"/>
+                <w:lang w:val="en-PH" w:eastAsia="en-US" w:bidi="ar-SA"/>
+              </w:rPr>
+              <w:t>_</w:t>
+            </w:r>
+            <w:r>
+              <w:rPr>
+                <w:rFonts w:eastAsia="Arial" w:cs="Arial" w:ascii="Arial" w:hAnsi="Arial"/>
+                <w:i/>
+                <w:iCs/>
+                <w:color w:themeColor="text1" w:val="000000"/>
+                <w:kern w:val="0"/>
+                <w:sz w:val="22"/>
+                <w:szCs w:val="22"/>
+                <w:lang w:val="en-PH" w:eastAsia="en-US" w:bidi="ar-SA"/>
+              </w:rPr>
+              <w:t>d</w:t>
+            </w:r>
+            <w:r>
+              <w:rPr>
+                <w:rFonts w:eastAsia="Arial" w:cs="Arial" w:ascii="Arial" w:hAnsi="Arial"/>
+                <w:i/>
+                <w:iCs/>
+                <w:color w:themeColor="text1" w:val="000000"/>
+                <w:kern w:val="0"/>
+                <w:sz w:val="22"/>
+                <w:szCs w:val="22"/>
+                <w:lang w:val="en-PH" w:eastAsia="en-US" w:bidi="ar-SA"/>
+              </w:rPr>
+              <w:t>e</w:t>
+            </w:r>
+            <w:r>
+              <w:rPr>
+                <w:rFonts w:eastAsia="Arial" w:cs="Arial" w:ascii="Arial" w:hAnsi="Arial"/>
+                <w:i/>
+                <w:iCs/>
+                <w:color w:themeColor="text1" w:val="000000"/>
+                <w:kern w:val="0"/>
+                <w:sz w:val="22"/>
+                <w:szCs w:val="22"/>
+                <w:lang w:val="en-PH" w:eastAsia="en-US" w:bidi="ar-SA"/>
+              </w:rPr>
+              <w:t>s</w:t>
+            </w:r>
+            <w:r>
+              <w:rPr>
+                <w:rFonts w:eastAsia="Arial" w:cs="Arial" w:ascii="Arial" w:hAnsi="Arial"/>
+                <w:i/>
+                <w:iCs/>
+                <w:color w:themeColor="text1" w:val="000000"/>
+                <w:kern w:val="0"/>
+                <w:sz w:val="22"/>
+                <w:szCs w:val="22"/>
+                <w:lang w:val="en-PH" w:eastAsia="en-US" w:bidi="ar-SA"/>
+              </w:rPr>
+              <w:t>i</w:t>
+            </w:r>
+            <w:r>
+              <w:rPr>
+                <w:rFonts w:eastAsia="Arial" w:cs="Arial" w:ascii="Arial" w:hAnsi="Arial"/>
+                <w:i/>
+                <w:iCs/>
+                <w:color w:themeColor="text1" w:val="000000"/>
+                <w:kern w:val="0"/>
+                <w:sz w:val="22"/>
+                <w:szCs w:val="22"/>
+                <w:lang w:val="en-PH" w:eastAsia="en-US" w:bidi="ar-SA"/>
+              </w:rPr>
+              <w:t>g</w:t>
+            </w:r>
+            <w:r>
+              <w:rPr>
+                <w:rFonts w:eastAsia="Arial" w:cs="Arial" w:ascii="Arial" w:hAnsi="Arial"/>
+                <w:i/>
+                <w:iCs/>
+                <w:color w:themeColor="text1" w:val="000000"/>
+                <w:kern w:val="0"/>
+                <w:sz w:val="22"/>
+                <w:szCs w:val="22"/>
+                <w:lang w:val="en-PH" w:eastAsia="en-US" w:bidi="ar-SA"/>
+              </w:rPr>
+              <w:t>n</w:t>
+            </w:r>
+            <w:r>
+              <w:rPr>
+                <w:rFonts w:eastAsia="Arial" w:cs="Arial" w:ascii="Arial" w:hAnsi="Arial"/>
+                <w:i/>
+                <w:iCs/>
+                <w:color w:themeColor="text1" w:val="000000"/>
+                <w:kern w:val="0"/>
+                <w:sz w:val="22"/>
+                <w:szCs w:val="22"/>
+                <w:lang w:val="en-PH" w:eastAsia="en-US" w:bidi="ar-SA"/>
+              </w:rPr>
+              <w:t>a</w:t>
+            </w:r>
+            <w:r>
+              <w:rPr>
+                <w:rFonts w:eastAsia="Arial" w:cs="Arial" w:ascii="Arial" w:hAnsi="Arial"/>
+                <w:i/>
+                <w:iCs/>
+                <w:color w:themeColor="text1" w:val="000000"/>
+                <w:kern w:val="0"/>
+                <w:sz w:val="22"/>
+                <w:szCs w:val="22"/>
+                <w:lang w:val="en-PH" w:eastAsia="en-US" w:bidi="ar-SA"/>
+              </w:rPr>
+              <w:t>t</w:t>
+            </w:r>
+            <w:r>
+              <w:rPr>
+                <w:rFonts w:eastAsia="Arial" w:cs="Arial" w:ascii="Arial" w:hAnsi="Arial"/>
+                <w:i/>
+                <w:iCs/>
+                <w:color w:themeColor="text1" w:val="000000"/>
+                <w:kern w:val="0"/>
+                <w:sz w:val="22"/>
+                <w:szCs w:val="22"/>
+                <w:lang w:val="en-PH" w:eastAsia="en-US" w:bidi="ar-SA"/>
+              </w:rPr>
+              <w:t>i</w:t>
+            </w:r>
+            <w:r>
+              <w:rPr>
+                <w:rFonts w:eastAsia="Arial" w:cs="Arial" w:ascii="Arial" w:hAnsi="Arial"/>
+                <w:i/>
+                <w:iCs/>
+                <w:color w:themeColor="text1" w:val="000000"/>
+                <w:kern w:val="0"/>
+                <w:sz w:val="22"/>
+                <w:szCs w:val="22"/>
+                <w:lang w:val="en-PH" w:eastAsia="en-US" w:bidi="ar-SA"/>
+              </w:rPr>
+              <w:t>o</w:t>
+            </w:r>
+            <w:r>
+              <w:rPr>
+                <w:rFonts w:eastAsia="Arial" w:cs="Arial" w:ascii="Arial" w:hAnsi="Arial"/>
+                <w:i/>
+                <w:iCs/>
+                <w:color w:themeColor="text1" w:val="000000"/>
+                <w:kern w:val="0"/>
+                <w:sz w:val="22"/>
+                <w:szCs w:val="22"/>
+                <w:lang w:val="en-PH" w:eastAsia="en-US" w:bidi="ar-SA"/>
+              </w:rPr>
+              <w:t>n</w:t>
+            </w:r>
+            <w:r>
+              <w:rPr>
+                <w:rFonts w:eastAsia="Arial" w:cs="Arial" w:ascii="Arial" w:hAnsi="Arial"/>
+                <w:i/>
+                <w:iCs/>
+                <w:color w:themeColor="text1" w:val="000000"/>
+                <w:kern w:val="0"/>
+                <w:sz w:val="22"/>
+                <w:szCs w:val="22"/>
+                <w:lang w:val="en-PH" w:eastAsia="en-US" w:bidi="ar-SA"/>
+              </w:rPr>
+              <w:t>}</w:t>
+            </w:r>
+            <w:r>
+              <w:rPr>
+                <w:rFonts w:eastAsia="Arial" w:cs="Arial" w:ascii="Arial" w:hAnsi="Arial"/>
+                <w:i/>
+                <w:iCs/>
+                <w:color w:themeColor="text1" w:val="000000"/>
+                <w:kern w:val="0"/>
+                <w:sz w:val="22"/>
+                <w:szCs w:val="22"/>
+                <w:lang w:val="en-PH" w:eastAsia="en-US" w:bidi="ar-SA"/>
+              </w:rPr>
+              <w:t>}</w:t>
             </w:r>
           </w:p>
           <w:p>
@@ -1876,7 +2318,189 @@
                 <w:szCs w:val="22"/>
                 <w:lang w:val="en-PH" w:eastAsia="en-US" w:bidi="ar-SA"/>
               </w:rPr>
-              <w:t>[Date]</w:t>
+              <w:t>{</w:t>
+            </w:r>
+            <w:r>
+              <w:rPr>
+                <w:rFonts w:eastAsia="Arial" w:cs="Arial" w:ascii="Arial" w:hAnsi="Arial"/>
+                <w:i/>
+                <w:iCs/>
+                <w:color w:themeColor="text1" w:val="000000"/>
+                <w:kern w:val="0"/>
+                <w:sz w:val="22"/>
+                <w:szCs w:val="22"/>
+                <w:lang w:val="en-PH" w:eastAsia="en-US" w:bidi="ar-SA"/>
+              </w:rPr>
+              <w:t>{</w:t>
+            </w:r>
+            <w:r>
+              <w:rPr>
+                <w:rFonts w:eastAsia="Arial" w:cs="Arial" w:ascii="Arial" w:hAnsi="Arial"/>
+                <w:i/>
+                <w:iCs/>
+                <w:color w:themeColor="text1" w:val="000000"/>
+                <w:kern w:val="0"/>
+                <w:sz w:val="22"/>
+                <w:szCs w:val="22"/>
+                <w:lang w:val="en-PH" w:eastAsia="en-US" w:bidi="ar-SA"/>
+              </w:rPr>
+              <w:t>e</w:t>
+            </w:r>
+            <w:r>
+              <w:rPr>
+                <w:rFonts w:eastAsia="Arial" w:cs="Arial" w:ascii="Arial" w:hAnsi="Arial"/>
+                <w:i/>
+                <w:iCs/>
+                <w:color w:themeColor="text1" w:val="000000"/>
+                <w:kern w:val="0"/>
+                <w:sz w:val="22"/>
+                <w:szCs w:val="22"/>
+                <w:lang w:val="en-PH" w:eastAsia="en-US" w:bidi="ar-SA"/>
+              </w:rPr>
+              <w:t>n</w:t>
+            </w:r>
+            <w:r>
+              <w:rPr>
+                <w:rFonts w:eastAsia="Arial" w:cs="Arial" w:ascii="Arial" w:hAnsi="Arial"/>
+                <w:i/>
+                <w:iCs/>
+                <w:color w:themeColor="text1" w:val="000000"/>
+                <w:kern w:val="0"/>
+                <w:sz w:val="22"/>
+                <w:szCs w:val="22"/>
+                <w:lang w:val="en-PH" w:eastAsia="en-US" w:bidi="ar-SA"/>
+              </w:rPr>
+              <w:t>t</w:t>
+            </w:r>
+            <w:r>
+              <w:rPr>
+                <w:rFonts w:eastAsia="Arial" w:cs="Arial" w:ascii="Arial" w:hAnsi="Arial"/>
+                <w:i/>
+                <w:iCs/>
+                <w:color w:themeColor="text1" w:val="000000"/>
+                <w:kern w:val="0"/>
+                <w:sz w:val="22"/>
+                <w:szCs w:val="22"/>
+                <w:lang w:val="en-PH" w:eastAsia="en-US" w:bidi="ar-SA"/>
+              </w:rPr>
+              <w:t>i</w:t>
+            </w:r>
+            <w:r>
+              <w:rPr>
+                <w:rFonts w:eastAsia="Arial" w:cs="Arial" w:ascii="Arial" w:hAnsi="Arial"/>
+                <w:i/>
+                <w:iCs/>
+                <w:color w:themeColor="text1" w:val="000000"/>
+                <w:kern w:val="0"/>
+                <w:sz w:val="22"/>
+                <w:szCs w:val="22"/>
+                <w:lang w:val="en-PH" w:eastAsia="en-US" w:bidi="ar-SA"/>
+              </w:rPr>
+              <w:t>t</w:t>
+            </w:r>
+            <w:r>
+              <w:rPr>
+                <w:rFonts w:eastAsia="Arial" w:cs="Arial" w:ascii="Arial" w:hAnsi="Arial"/>
+                <w:i/>
+                <w:iCs/>
+                <w:color w:themeColor="text1" w:val="000000"/>
+                <w:kern w:val="0"/>
+                <w:sz w:val="22"/>
+                <w:szCs w:val="22"/>
+                <w:lang w:val="en-PH" w:eastAsia="en-US" w:bidi="ar-SA"/>
+              </w:rPr>
+              <w:t>y</w:t>
+            </w:r>
+            <w:r>
+              <w:rPr>
+                <w:rFonts w:eastAsia="Arial" w:cs="Arial" w:ascii="Arial" w:hAnsi="Arial"/>
+                <w:i/>
+                <w:iCs/>
+                <w:color w:themeColor="text1" w:val="000000"/>
+                <w:kern w:val="0"/>
+                <w:sz w:val="22"/>
+                <w:szCs w:val="22"/>
+                <w:lang w:val="en-PH" w:eastAsia="en-US" w:bidi="ar-SA"/>
+              </w:rPr>
+              <w:t>_</w:t>
+            </w:r>
+            <w:r>
+              <w:rPr>
+                <w:rFonts w:eastAsia="Arial" w:cs="Arial" w:ascii="Arial" w:hAnsi="Arial"/>
+                <w:i/>
+                <w:iCs/>
+                <w:color w:themeColor="text1" w:val="000000"/>
+                <w:kern w:val="0"/>
+                <w:sz w:val="22"/>
+                <w:szCs w:val="22"/>
+                <w:lang w:val="en-PH" w:eastAsia="en-US" w:bidi="ar-SA"/>
+              </w:rPr>
+              <w:t>d</w:t>
+            </w:r>
+            <w:r>
+              <w:rPr>
+                <w:rFonts w:eastAsia="Arial" w:cs="Arial" w:ascii="Arial" w:hAnsi="Arial"/>
+                <w:i/>
+                <w:iCs/>
+                <w:color w:themeColor="text1" w:val="000000"/>
+                <w:kern w:val="0"/>
+                <w:sz w:val="22"/>
+                <w:szCs w:val="22"/>
+                <w:lang w:val="en-PH" w:eastAsia="en-US" w:bidi="ar-SA"/>
+              </w:rPr>
+              <w:t>a</w:t>
+            </w:r>
+            <w:r>
+              <w:rPr>
+                <w:rFonts w:eastAsia="Arial" w:cs="Arial" w:ascii="Arial" w:hAnsi="Arial"/>
+                <w:i/>
+                <w:iCs/>
+                <w:color w:themeColor="text1" w:val="000000"/>
+                <w:kern w:val="0"/>
+                <w:sz w:val="22"/>
+                <w:szCs w:val="22"/>
+                <w:lang w:val="en-PH" w:eastAsia="en-US" w:bidi="ar-SA"/>
+              </w:rPr>
+              <w:t>t</w:t>
+            </w:r>
+            <w:r>
+              <w:rPr>
+                <w:rFonts w:eastAsia="Arial" w:cs="Arial" w:ascii="Arial" w:hAnsi="Arial"/>
+                <w:i/>
+                <w:iCs/>
+                <w:color w:themeColor="text1" w:val="000000"/>
+                <w:kern w:val="0"/>
+                <w:sz w:val="22"/>
+                <w:szCs w:val="22"/>
+                <w:lang w:val="en-PH" w:eastAsia="en-US" w:bidi="ar-SA"/>
+              </w:rPr>
+              <w:t>e</w:t>
+            </w:r>
+            <w:r>
+              <w:rPr>
+                <w:rFonts w:eastAsia="Arial" w:cs="Arial" w:ascii="Arial" w:hAnsi="Arial"/>
+                <w:i/>
+                <w:iCs/>
+                <w:color w:themeColor="text1" w:val="000000"/>
+                <w:kern w:val="0"/>
+                <w:sz w:val="22"/>
+                <w:szCs w:val="22"/>
+                <w:lang w:val="en-PH" w:eastAsia="en-US" w:bidi="ar-SA"/>
+              </w:rPr>
+              <w:t>}</w:t>
+            </w:r>
+            <w:r>
+              <w:rPr>
+                <w:rFonts w:eastAsia="Arial" w:cs="Arial" w:ascii="Arial" w:hAnsi="Arial"/>
+                <w:i/>
+                <w:iCs/>
+                <w:color w:themeColor="text1" w:val="000000"/>
+                <w:kern w:val="0"/>
+                <w:sz w:val="22"/>
+                <w:szCs w:val="22"/>
+                <w:lang w:val="en-PH" w:eastAsia="en-US" w:bidi="ar-SA"/>
+              </w:rPr>
+              <w:t>}</w:t>
             </w:r>
           </w:p>
           <w:p>
@@ -1943,280 +2567,7 @@
                 <w:szCs w:val="22"/>
                 <w:lang w:val="en-PH" w:eastAsia="en-US" w:bidi="ar-SA"/>
               </w:rPr>
-              <w:t>{</w:t>
-            </w:r>
-            <w:r>
-              <w:rPr>
-                <w:rFonts w:eastAsia="Arial" w:cs="Arial" w:ascii="Arial" w:hAnsi="Arial"/>
-                <w:i/>
-                <w:iCs/>
-                <w:color w:themeColor="text1" w:val="000000"/>
-                <w:kern w:val="0"/>
-                <w:sz w:val="22"/>
-                <w:szCs w:val="22"/>
-                <w:lang w:val="en-PH" w:eastAsia="en-US" w:bidi="ar-SA"/>
-              </w:rPr>
-              <w:t>{</w:t>
-            </w:r>
-            <w:r>
-              <w:rPr>
-                <w:rFonts w:eastAsia="Arial" w:cs="Arial" w:ascii="Arial" w:hAnsi="Arial"/>
-                <w:i/>
-                <w:iCs/>
-                <w:color w:themeColor="text1" w:val="000000"/>
-                <w:kern w:val="0"/>
-                <w:sz w:val="22"/>
-                <w:szCs w:val="22"/>
-                <w:lang w:val="en-PH" w:eastAsia="en-US" w:bidi="ar-SA"/>
-              </w:rPr>
-              <w:t>c</w:t>
-            </w:r>
-            <w:r>
-              <w:rPr>
-                <w:rFonts w:eastAsia="Arial" w:cs="Arial" w:ascii="Arial" w:hAnsi="Arial"/>
-                <w:i/>
-                <w:iCs/>
-                <w:color w:themeColor="text1" w:val="000000"/>
-                <w:kern w:val="0"/>
-                <w:sz w:val="22"/>
-                <w:szCs w:val="22"/>
-                <w:lang w:val="en-PH" w:eastAsia="en-US" w:bidi="ar-SA"/>
-              </w:rPr>
-              <w:t>o</w:t>
-            </w:r>
-            <w:r>
-              <w:rPr>
-                <w:rFonts w:eastAsia="Arial" w:cs="Arial" w:ascii="Arial" w:hAnsi="Arial"/>
-                <w:i/>
-                <w:iCs/>
-                <w:color w:themeColor="text1" w:val="000000"/>
-                <w:kern w:val="0"/>
-                <w:sz w:val="22"/>
-                <w:szCs w:val="22"/>
-                <w:lang w:val="en-PH" w:eastAsia="en-US" w:bidi="ar-SA"/>
-              </w:rPr>
-              <w:t>m</w:t>
-            </w:r>
-            <w:r>
-              <w:rPr>
-                <w:rFonts w:eastAsia="Arial" w:cs="Arial" w:ascii="Arial" w:hAnsi="Arial"/>
-                <w:i/>
-                <w:iCs/>
-                <w:color w:themeColor="text1" w:val="000000"/>
-                <w:kern w:val="0"/>
-                <w:sz w:val="22"/>
-                <w:szCs w:val="22"/>
-                <w:lang w:val="en-PH" w:eastAsia="en-US" w:bidi="ar-SA"/>
-              </w:rPr>
-              <w:t>p</w:t>
-            </w:r>
-            <w:r>
-              <w:rPr>
-                <w:rFonts w:eastAsia="Arial" w:cs="Arial" w:ascii="Arial" w:hAnsi="Arial"/>
-                <w:i/>
-                <w:iCs/>
-                <w:color w:themeColor="text1" w:val="000000"/>
-                <w:kern w:val="0"/>
-                <w:sz w:val="22"/>
-                <w:szCs w:val="22"/>
-                <w:lang w:val="en-PH" w:eastAsia="en-US" w:bidi="ar-SA"/>
-              </w:rPr>
-              <w:t>a</w:t>
-            </w:r>
-            <w:r>
-              <w:rPr>
-                <w:rFonts w:eastAsia="Arial" w:cs="Arial" w:ascii="Arial" w:hAnsi="Arial"/>
-                <w:i/>
-                <w:iCs/>
-                <w:color w:themeColor="text1" w:val="000000"/>
-                <w:kern w:val="0"/>
-                <w:sz w:val="22"/>
-                <w:szCs w:val="22"/>
-                <w:lang w:val="en-PH" w:eastAsia="en-US" w:bidi="ar-SA"/>
-              </w:rPr>
-              <w:t>n</w:t>
-            </w:r>
-            <w:r>
-              <w:rPr>
-                <w:rFonts w:eastAsia="Arial" w:cs="Arial" w:ascii="Arial" w:hAnsi="Arial"/>
-                <w:i/>
-                <w:iCs/>
-                <w:color w:themeColor="text1" w:val="000000"/>
-                <w:kern w:val="0"/>
-                <w:sz w:val="22"/>
-                <w:szCs w:val="22"/>
-                <w:lang w:val="en-PH" w:eastAsia="en-US" w:bidi="ar-SA"/>
-              </w:rPr>
-              <w:t>y</w:t>
-            </w:r>
-            <w:r>
-              <w:rPr>
-                <w:rFonts w:eastAsia="Arial" w:cs="Arial" w:ascii="Arial" w:hAnsi="Arial"/>
-                <w:i/>
-                <w:iCs/>
-                <w:color w:themeColor="text1" w:val="000000"/>
-                <w:kern w:val="0"/>
-                <w:sz w:val="22"/>
-                <w:szCs w:val="22"/>
-                <w:lang w:val="en-PH" w:eastAsia="en-US" w:bidi="ar-SA"/>
-              </w:rPr>
-              <w:t>_</w:t>
-            </w:r>
-            <w:r>
-              <w:rPr>
-                <w:rFonts w:eastAsia="Arial" w:cs="Arial" w:ascii="Arial" w:hAnsi="Arial"/>
-                <w:i/>
-                <w:iCs/>
-                <w:color w:themeColor="text1" w:val="000000"/>
-                <w:kern w:val="0"/>
-                <w:sz w:val="22"/>
-                <w:szCs w:val="22"/>
-                <w:lang w:val="en-PH" w:eastAsia="en-US" w:bidi="ar-SA"/>
-              </w:rPr>
-              <w:t>n</w:t>
-            </w:r>
-            <w:r>
-              <w:rPr>
-                <w:rFonts w:eastAsia="Arial" w:cs="Arial" w:ascii="Arial" w:hAnsi="Arial"/>
-                <w:i/>
-                <w:iCs/>
-                <w:color w:themeColor="text1" w:val="000000"/>
-                <w:kern w:val="0"/>
-                <w:sz w:val="22"/>
-                <w:szCs w:val="22"/>
-                <w:lang w:val="en-PH" w:eastAsia="en-US" w:bidi="ar-SA"/>
-              </w:rPr>
-              <w:t>a</w:t>
-            </w:r>
-            <w:r>
-              <w:rPr>
-                <w:rFonts w:eastAsia="Arial" w:cs="Arial" w:ascii="Arial" w:hAnsi="Arial"/>
-                <w:i/>
-                <w:iCs/>
-                <w:color w:themeColor="text1" w:val="000000"/>
-                <w:kern w:val="0"/>
-                <w:sz w:val="22"/>
-                <w:szCs w:val="22"/>
-                <w:lang w:val="en-PH" w:eastAsia="en-US" w:bidi="ar-SA"/>
-              </w:rPr>
-              <w:t>m</w:t>
-            </w:r>
-            <w:r>
-              <w:rPr>
-                <w:rFonts w:eastAsia="Arial" w:cs="Arial" w:ascii="Arial" w:hAnsi="Arial"/>
-                <w:i/>
-                <w:iCs/>
-                <w:color w:themeColor="text1" w:val="000000"/>
-                <w:kern w:val="0"/>
-                <w:sz w:val="22"/>
-                <w:szCs w:val="22"/>
-                <w:lang w:val="en-PH" w:eastAsia="en-US" w:bidi="ar-SA"/>
-              </w:rPr>
-              <w:t>e</w:t>
-            </w:r>
-            <w:r>
-              <w:rPr>
-                <w:rFonts w:eastAsia="Arial" w:cs="Arial" w:ascii="Arial" w:hAnsi="Arial"/>
-                <w:i/>
-                <w:iCs/>
-                <w:color w:themeColor="text1" w:val="000000"/>
-                <w:kern w:val="0"/>
-                <w:sz w:val="22"/>
-                <w:szCs w:val="22"/>
-                <w:lang w:val="en-PH" w:eastAsia="en-US" w:bidi="ar-SA"/>
-              </w:rPr>
-              <w:t>_</w:t>
-            </w:r>
-            <w:r>
-              <w:rPr>
-                <w:rFonts w:eastAsia="Arial" w:cs="Arial" w:ascii="Arial" w:hAnsi="Arial"/>
-                <w:i/>
-                <w:iCs/>
-                <w:color w:themeColor="text1" w:val="000000"/>
-                <w:kern w:val="0"/>
-                <w:sz w:val="22"/>
-                <w:szCs w:val="22"/>
-                <w:lang w:val="en-PH" w:eastAsia="en-US" w:bidi="ar-SA"/>
-              </w:rPr>
-              <w:t>u</w:t>
-            </w:r>
-            <w:r>
-              <w:rPr>
-                <w:rFonts w:eastAsia="Arial" w:cs="Arial" w:ascii="Arial" w:hAnsi="Arial"/>
-                <w:i/>
-                <w:iCs/>
-                <w:color w:themeColor="text1" w:val="000000"/>
-                <w:kern w:val="0"/>
-                <w:sz w:val="22"/>
-                <w:szCs w:val="22"/>
-                <w:lang w:val="en-PH" w:eastAsia="en-US" w:bidi="ar-SA"/>
-              </w:rPr>
-              <w:t>p</w:t>
-            </w:r>
-            <w:r>
-              <w:rPr>
-                <w:rFonts w:eastAsia="Arial" w:cs="Arial" w:ascii="Arial" w:hAnsi="Arial"/>
-                <w:i/>
-                <w:iCs/>
-                <w:color w:themeColor="text1" w:val="000000"/>
-                <w:kern w:val="0"/>
-                <w:sz w:val="22"/>
-                <w:szCs w:val="22"/>
-                <w:lang w:val="en-PH" w:eastAsia="en-US" w:bidi="ar-SA"/>
-              </w:rPr>
-              <w:t>p</w:t>
-            </w:r>
-            <w:r>
-              <w:rPr>
-                <w:rFonts w:eastAsia="Arial" w:cs="Arial" w:ascii="Arial" w:hAnsi="Arial"/>
-                <w:i/>
-                <w:iCs/>
-                <w:color w:themeColor="text1" w:val="000000"/>
-                <w:kern w:val="0"/>
-                <w:sz w:val="22"/>
-                <w:szCs w:val="22"/>
-                <w:lang w:val="en-PH" w:eastAsia="en-US" w:bidi="ar-SA"/>
-              </w:rPr>
-              <w:t>e</w:t>
-            </w:r>
-            <w:r>
-              <w:rPr>
-                <w:rFonts w:eastAsia="Arial" w:cs="Arial" w:ascii="Arial" w:hAnsi="Arial"/>
-                <w:i/>
-                <w:iCs/>
-                <w:color w:themeColor="text1" w:val="000000"/>
-                <w:kern w:val="0"/>
-                <w:sz w:val="22"/>
-                <w:szCs w:val="22"/>
-                <w:lang w:val="en-PH" w:eastAsia="en-US" w:bidi="ar-SA"/>
-              </w:rPr>
-              <w:t>r</w:t>
-            </w:r>
-            <w:r>
-              <w:rPr>
-                <w:rFonts w:eastAsia="Arial" w:cs="Arial" w:ascii="Arial" w:hAnsi="Arial"/>
-                <w:i/>
-                <w:iCs/>
-                <w:color w:themeColor="text1" w:val="000000"/>
-                <w:kern w:val="0"/>
-                <w:sz w:val="22"/>
-                <w:szCs w:val="22"/>
-                <w:lang w:val="en-PH" w:eastAsia="en-US" w:bidi="ar-SA"/>
-              </w:rPr>
-              <w:t>}</w:t>
-            </w:r>
-            <w:r>
-              <w:rPr>
-                <w:rFonts w:eastAsia="Arial" w:cs="Arial" w:ascii="Arial" w:hAnsi="Arial"/>
-                <w:i/>
-                <w:iCs/>
-                <w:color w:themeColor="text1" w:val="000000"/>
-                <w:kern w:val="0"/>
-                <w:sz w:val="22"/>
-                <w:szCs w:val="22"/>
-                <w:lang w:val="en-PH" w:eastAsia="en-US" w:bidi="ar-SA"/>
-              </w:rPr>
-              <w:t>}</w:t>
+              <w:t>{{company_name_upper}}</w:t>
             </w:r>
             <w:r>
               <w:rPr>
@@ -2370,7 +2721,449 @@
                 <w:szCs w:val="22"/>
                 <w:lang w:val="en-PH" w:eastAsia="en-US" w:bidi="ar-SA"/>
               </w:rPr>
-              <w:t>[Position/Designation]</w:t>
+              <w:t>{</w:t>
+            </w:r>
+            <w:r>
+              <w:rPr>
+                <w:rFonts w:eastAsia="Arial" w:cs="Arial" w:ascii="Arial" w:hAnsi="Arial"/>
+                <w:i/>
+                <w:iCs/>
+                <w:color w:themeColor="text1" w:val="000000"/>
+                <w:kern w:val="0"/>
+                <w:sz w:val="22"/>
+                <w:szCs w:val="22"/>
+                <w:lang w:val="en-PH" w:eastAsia="en-US" w:bidi="ar-SA"/>
+              </w:rPr>
+              <w:t>{</w:t>
+            </w:r>
+            <w:r>
+              <w:rPr>
+                <w:rFonts w:eastAsia="Arial" w:cs="Arial" w:ascii="Arial" w:hAnsi="Arial"/>
+                <w:i/>
+                <w:iCs/>
+                <w:color w:themeColor="text1" w:val="000000"/>
+                <w:kern w:val="0"/>
+                <w:sz w:val="22"/>
+                <w:szCs w:val="22"/>
+                <w:lang w:val="en-PH" w:eastAsia="en-US" w:bidi="ar-SA"/>
+              </w:rPr>
+              <w:t>p</w:t>
+            </w:r>
+            <w:r>
+              <w:rPr>
+                <w:rFonts w:eastAsia="Arial" w:cs="Arial" w:ascii="Arial" w:hAnsi="Arial"/>
+                <w:i/>
+                <w:iCs/>
+                <w:color w:themeColor="text1" w:val="000000"/>
+                <w:kern w:val="0"/>
+                <w:sz w:val="22"/>
+                <w:szCs w:val="22"/>
+                <w:lang w:val="en-PH" w:eastAsia="en-US" w:bidi="ar-SA"/>
+              </w:rPr>
+              <w:t>r</w:t>
+            </w:r>
+            <w:r>
+              <w:rPr>
+                <w:rFonts w:eastAsia="Arial" w:cs="Arial" w:ascii="Arial" w:hAnsi="Arial"/>
+                <w:i/>
+                <w:iCs/>
+                <w:color w:themeColor="text1" w:val="000000"/>
+                <w:kern w:val="0"/>
+                <w:sz w:val="22"/>
+                <w:szCs w:val="22"/>
+                <w:lang w:val="en-PH" w:eastAsia="en-US" w:bidi="ar-SA"/>
+              </w:rPr>
+              <w:t>o</w:t>
+            </w:r>
+            <w:r>
+              <w:rPr>
+                <w:rFonts w:eastAsia="Arial" w:cs="Arial" w:ascii="Arial" w:hAnsi="Arial"/>
+                <w:i/>
+                <w:iCs/>
+                <w:color w:themeColor="text1" w:val="000000"/>
+                <w:kern w:val="0"/>
+                <w:sz w:val="22"/>
+                <w:szCs w:val="22"/>
+                <w:lang w:val="en-PH" w:eastAsia="en-US" w:bidi="ar-SA"/>
+              </w:rPr>
+              <w:t>p</w:t>
+            </w:r>
+            <w:r>
+              <w:rPr>
+                <w:rFonts w:eastAsia="Arial" w:cs="Arial" w:ascii="Arial" w:hAnsi="Arial"/>
+                <w:i/>
+                <w:iCs/>
+                <w:color w:themeColor="text1" w:val="000000"/>
+                <w:kern w:val="0"/>
+                <w:sz w:val="22"/>
+                <w:szCs w:val="22"/>
+                <w:lang w:val="en-PH" w:eastAsia="en-US" w:bidi="ar-SA"/>
+              </w:rPr>
+              <w:t>r</w:t>
+            </w:r>
+            <w:r>
+              <w:rPr>
+                <w:rFonts w:eastAsia="Arial" w:cs="Arial" w:ascii="Arial" w:hAnsi="Arial"/>
+                <w:i/>
+                <w:iCs/>
+                <w:color w:themeColor="text1" w:val="000000"/>
+                <w:kern w:val="0"/>
+                <w:sz w:val="22"/>
+                <w:szCs w:val="22"/>
+                <w:lang w:val="en-PH" w:eastAsia="en-US" w:bidi="ar-SA"/>
+              </w:rPr>
+              <w:t>i</w:t>
+            </w:r>
+            <w:r>
+              <w:rPr>
+                <w:rFonts w:eastAsia="Arial" w:cs="Arial" w:ascii="Arial" w:hAnsi="Arial"/>
+                <w:i/>
+                <w:iCs/>
+                <w:color w:themeColor="text1" w:val="000000"/>
+                <w:kern w:val="0"/>
+                <w:sz w:val="22"/>
+                <w:szCs w:val="22"/>
+                <w:lang w:val="en-PH" w:eastAsia="en-US" w:bidi="ar-SA"/>
+              </w:rPr>
+              <w:t>e</w:t>
+            </w:r>
+            <w:r>
+              <w:rPr>
+                <w:rFonts w:eastAsia="Arial" w:cs="Arial" w:ascii="Arial" w:hAnsi="Arial"/>
+                <w:i/>
+                <w:iCs/>
+                <w:color w:themeColor="text1" w:val="000000"/>
+                <w:kern w:val="0"/>
+                <w:sz w:val="22"/>
+                <w:szCs w:val="22"/>
+                <w:lang w:val="en-PH" w:eastAsia="en-US" w:bidi="ar-SA"/>
+              </w:rPr>
+              <w:t>t</w:t>
+            </w:r>
+            <w:r>
+              <w:rPr>
+                <w:rFonts w:eastAsia="Arial" w:cs="Arial" w:ascii="Arial" w:hAnsi="Arial"/>
+                <w:i/>
+                <w:iCs/>
+                <w:color w:themeColor="text1" w:val="000000"/>
+                <w:kern w:val="0"/>
+                <w:sz w:val="22"/>
+                <w:szCs w:val="22"/>
+                <w:lang w:val="en-PH" w:eastAsia="en-US" w:bidi="ar-SA"/>
+              </w:rPr>
+              <w:t>o</w:t>
+            </w:r>
+            <w:r>
+              <w:rPr>
+                <w:rFonts w:eastAsia="Arial" w:cs="Arial" w:ascii="Arial" w:hAnsi="Arial"/>
+                <w:i/>
+                <w:iCs/>
+                <w:color w:themeColor="text1" w:val="000000"/>
+                <w:kern w:val="0"/>
+                <w:sz w:val="22"/>
+                <w:szCs w:val="22"/>
+                <w:lang w:val="en-PH" w:eastAsia="en-US" w:bidi="ar-SA"/>
+              </w:rPr>
+              <w:t>r</w:t>
+            </w:r>
+            <w:r>
+              <w:rPr>
+                <w:rFonts w:eastAsia="Arial" w:cs="Arial" w:ascii="Arial" w:hAnsi="Arial"/>
+                <w:i/>
+                <w:iCs/>
+                <w:color w:themeColor="text1" w:val="000000"/>
+                <w:kern w:val="0"/>
+                <w:sz w:val="22"/>
+                <w:szCs w:val="22"/>
+                <w:lang w:val="en-PH" w:eastAsia="en-US" w:bidi="ar-SA"/>
+              </w:rPr>
+              <w:t>_</w:t>
+            </w:r>
+            <w:r>
+              <w:rPr>
+                <w:rFonts w:eastAsia="Arial" w:cs="Arial" w:ascii="Arial" w:hAnsi="Arial"/>
+                <w:i/>
+                <w:iCs/>
+                <w:color w:themeColor="text1" w:val="000000"/>
+                <w:kern w:val="0"/>
+                <w:sz w:val="22"/>
+                <w:szCs w:val="22"/>
+                <w:lang w:val="en-PH" w:eastAsia="en-US" w:bidi="ar-SA"/>
+              </w:rPr>
+              <w:t>p</w:t>
+            </w:r>
+            <w:r>
+              <w:rPr>
+                <w:rFonts w:eastAsia="Arial" w:cs="Arial" w:ascii="Arial" w:hAnsi="Arial"/>
+                <w:i/>
+                <w:iCs/>
+                <w:color w:themeColor="text1" w:val="000000"/>
+                <w:kern w:val="0"/>
+                <w:sz w:val="22"/>
+                <w:szCs w:val="22"/>
+                <w:lang w:val="en-PH" w:eastAsia="en-US" w:bidi="ar-SA"/>
+              </w:rPr>
+              <w:t>o</w:t>
+            </w:r>
+            <w:r>
+              <w:rPr>
+                <w:rFonts w:eastAsia="Arial" w:cs="Arial" w:ascii="Arial" w:hAnsi="Arial"/>
+                <w:i/>
+                <w:iCs/>
+                <w:color w:themeColor="text1" w:val="000000"/>
+                <w:kern w:val="0"/>
+                <w:sz w:val="22"/>
+                <w:szCs w:val="22"/>
+                <w:lang w:val="en-PH" w:eastAsia="en-US" w:bidi="ar-SA"/>
+              </w:rPr>
+              <w:t>s</w:t>
+            </w:r>
+            <w:r>
+              <w:rPr>
+                <w:rFonts w:eastAsia="Arial" w:cs="Arial" w:ascii="Arial" w:hAnsi="Arial"/>
+                <w:i/>
+                <w:iCs/>
+                <w:color w:themeColor="text1" w:val="000000"/>
+                <w:kern w:val="0"/>
+                <w:sz w:val="22"/>
+                <w:szCs w:val="22"/>
+                <w:lang w:val="en-PH" w:eastAsia="en-US" w:bidi="ar-SA"/>
+              </w:rPr>
+              <w:t>i</w:t>
+            </w:r>
+            <w:r>
+              <w:rPr>
+                <w:rFonts w:eastAsia="Arial" w:cs="Arial" w:ascii="Arial" w:hAnsi="Arial"/>
+                <w:i/>
+                <w:iCs/>
+                <w:color w:themeColor="text1" w:val="000000"/>
+                <w:kern w:val="0"/>
+                <w:sz w:val="22"/>
+                <w:szCs w:val="22"/>
+                <w:lang w:val="en-PH" w:eastAsia="en-US" w:bidi="ar-SA"/>
+              </w:rPr>
+              <w:t>t</w:t>
+            </w:r>
+            <w:r>
+              <w:rPr>
+                <w:rFonts w:eastAsia="Arial" w:cs="Arial" w:ascii="Arial" w:hAnsi="Arial"/>
+                <w:i/>
+                <w:iCs/>
+                <w:color w:themeColor="text1" w:val="000000"/>
+                <w:kern w:val="0"/>
+                <w:sz w:val="22"/>
+                <w:szCs w:val="22"/>
+                <w:lang w:val="en-PH" w:eastAsia="en-US" w:bidi="ar-SA"/>
+              </w:rPr>
+              <w:t>i</w:t>
+            </w:r>
+            <w:r>
+              <w:rPr>
+                <w:rFonts w:eastAsia="Arial" w:cs="Arial" w:ascii="Arial" w:hAnsi="Arial"/>
+                <w:i/>
+                <w:iCs/>
+                <w:color w:themeColor="text1" w:val="000000"/>
+                <w:kern w:val="0"/>
+                <w:sz w:val="22"/>
+                <w:szCs w:val="22"/>
+                <w:lang w:val="en-PH" w:eastAsia="en-US" w:bidi="ar-SA"/>
+              </w:rPr>
+              <w:t>o</w:t>
+            </w:r>
+            <w:r>
+              <w:rPr>
+                <w:rFonts w:eastAsia="Arial" w:cs="Arial" w:ascii="Arial" w:hAnsi="Arial"/>
+                <w:i/>
+                <w:iCs/>
+                <w:color w:themeColor="text1" w:val="000000"/>
+                <w:kern w:val="0"/>
+                <w:sz w:val="22"/>
+                <w:szCs w:val="22"/>
+                <w:lang w:val="en-PH" w:eastAsia="en-US" w:bidi="ar-SA"/>
+              </w:rPr>
+              <w:t>n</w:t>
+            </w:r>
+            <w:r>
+              <w:rPr>
+                <w:rFonts w:eastAsia="Arial" w:cs="Arial" w:ascii="Arial" w:hAnsi="Arial"/>
+                <w:i/>
+                <w:iCs/>
+                <w:color w:themeColor="text1" w:val="000000"/>
+                <w:kern w:val="0"/>
+                <w:sz w:val="22"/>
+                <w:szCs w:val="22"/>
+                <w:lang w:val="en-PH" w:eastAsia="en-US" w:bidi="ar-SA"/>
+              </w:rPr>
+              <w:t>_</w:t>
+            </w:r>
+            <w:r>
+              <w:rPr>
+                <w:rFonts w:eastAsia="Arial" w:cs="Arial" w:ascii="Arial" w:hAnsi="Arial"/>
+                <w:i/>
+                <w:iCs/>
+                <w:color w:themeColor="text1" w:val="000000"/>
+                <w:kern w:val="0"/>
+                <w:sz w:val="22"/>
+                <w:szCs w:val="22"/>
+                <w:lang w:val="en-PH" w:eastAsia="en-US" w:bidi="ar-SA"/>
+              </w:rPr>
+              <w:t>d</w:t>
+            </w:r>
+            <w:r>
+              <w:rPr>
+                <w:rFonts w:eastAsia="Arial" w:cs="Arial" w:ascii="Arial" w:hAnsi="Arial"/>
+                <w:i/>
+                <w:iCs/>
+                <w:color w:themeColor="text1" w:val="000000"/>
+                <w:kern w:val="0"/>
+                <w:sz w:val="22"/>
+                <w:szCs w:val="22"/>
+                <w:lang w:val="en-PH" w:eastAsia="en-US" w:bidi="ar-SA"/>
+              </w:rPr>
+              <w:t>e</w:t>
+            </w:r>
+            <w:r>
+              <w:rPr>
+                <w:rFonts w:eastAsia="Arial" w:cs="Arial" w:ascii="Arial" w:hAnsi="Arial"/>
+                <w:i/>
+                <w:iCs/>
+                <w:color w:themeColor="text1" w:val="000000"/>
+                <w:kern w:val="0"/>
+                <w:sz w:val="22"/>
+                <w:szCs w:val="22"/>
+                <w:lang w:val="en-PH" w:eastAsia="en-US" w:bidi="ar-SA"/>
+              </w:rPr>
+              <w:t>s</w:t>
+            </w:r>
+            <w:r>
+              <w:rPr>
+                <w:rFonts w:eastAsia="Arial" w:cs="Arial" w:ascii="Arial" w:hAnsi="Arial"/>
+                <w:i/>
+                <w:iCs/>
+                <w:color w:themeColor="text1" w:val="000000"/>
+                <w:kern w:val="0"/>
+                <w:sz w:val="22"/>
+                <w:szCs w:val="22"/>
+                <w:lang w:val="en-PH" w:eastAsia="en-US" w:bidi="ar-SA"/>
+              </w:rPr>
+              <w:t>i</w:t>
+            </w:r>
+            <w:r>
+              <w:rPr>
+                <w:rFonts w:eastAsia="Arial" w:cs="Arial" w:ascii="Arial" w:hAnsi="Arial"/>
+                <w:i/>
+                <w:iCs/>
+                <w:color w:themeColor="text1" w:val="000000"/>
+                <w:kern w:val="0"/>
+                <w:sz w:val="22"/>
+                <w:szCs w:val="22"/>
+                <w:lang w:val="en-PH" w:eastAsia="en-US" w:bidi="ar-SA"/>
+              </w:rPr>
+              <w:t>g</w:t>
+            </w:r>
+            <w:r>
+              <w:rPr>
+                <w:rFonts w:eastAsia="Arial" w:cs="Arial" w:ascii="Arial" w:hAnsi="Arial"/>
+                <w:i/>
+                <w:iCs/>
+                <w:color w:themeColor="text1" w:val="000000"/>
+                <w:kern w:val="0"/>
+                <w:sz w:val="22"/>
+                <w:szCs w:val="22"/>
+                <w:lang w:val="en-PH" w:eastAsia="en-US" w:bidi="ar-SA"/>
+              </w:rPr>
+              <w:t>n</w:t>
+            </w:r>
+            <w:r>
+              <w:rPr>
+                <w:rFonts w:eastAsia="Arial" w:cs="Arial" w:ascii="Arial" w:hAnsi="Arial"/>
+                <w:i/>
+                <w:iCs/>
+                <w:color w:themeColor="text1" w:val="000000"/>
+                <w:kern w:val="0"/>
+                <w:sz w:val="22"/>
+                <w:szCs w:val="22"/>
+                <w:lang w:val="en-PH" w:eastAsia="en-US" w:bidi="ar-SA"/>
+              </w:rPr>
+              <w:t>a</w:t>
+            </w:r>
+            <w:r>
+              <w:rPr>
+                <w:rFonts w:eastAsia="Arial" w:cs="Arial" w:ascii="Arial" w:hAnsi="Arial"/>
+                <w:i/>
+                <w:iCs/>
+                <w:color w:themeColor="text1" w:val="000000"/>
+                <w:kern w:val="0"/>
+                <w:sz w:val="22"/>
+                <w:szCs w:val="22"/>
+                <w:lang w:val="en-PH" w:eastAsia="en-US" w:bidi="ar-SA"/>
+              </w:rPr>
+              <w:t>t</w:t>
+            </w:r>
+            <w:r>
+              <w:rPr>
+                <w:rFonts w:eastAsia="Arial" w:cs="Arial" w:ascii="Arial" w:hAnsi="Arial"/>
+                <w:i/>
+                <w:iCs/>
+                <w:color w:themeColor="text1" w:val="000000"/>
+                <w:kern w:val="0"/>
+                <w:sz w:val="22"/>
+                <w:szCs w:val="22"/>
+                <w:lang w:val="en-PH" w:eastAsia="en-US" w:bidi="ar-SA"/>
+              </w:rPr>
+              <w:t>i</w:t>
+            </w:r>
+            <w:r>
+              <w:rPr>
+                <w:rFonts w:eastAsia="Arial" w:cs="Arial" w:ascii="Arial" w:hAnsi="Arial"/>
+                <w:i/>
+                <w:iCs/>
+                <w:color w:themeColor="text1" w:val="000000"/>
+                <w:kern w:val="0"/>
+                <w:sz w:val="22"/>
+                <w:szCs w:val="22"/>
+                <w:lang w:val="en-PH" w:eastAsia="en-US" w:bidi="ar-SA"/>
+              </w:rPr>
+              <w:t>o</w:t>
+            </w:r>
+            <w:r>
+              <w:rPr>
+                <w:rFonts w:eastAsia="Arial" w:cs="Arial" w:ascii="Arial" w:hAnsi="Arial"/>
+                <w:i/>
+                <w:iCs/>
+                <w:color w:themeColor="text1" w:val="000000"/>
+                <w:kern w:val="0"/>
+                <w:sz w:val="22"/>
+                <w:szCs w:val="22"/>
+                <w:lang w:val="en-PH" w:eastAsia="en-US" w:bidi="ar-SA"/>
+              </w:rPr>
+              <w:t>n</w:t>
+            </w:r>
+            <w:r>
+              <w:rPr>
+                <w:rFonts w:eastAsia="Arial" w:cs="Arial" w:ascii="Arial" w:hAnsi="Arial"/>
+                <w:i/>
+                <w:iCs/>
+                <w:color w:themeColor="text1" w:val="000000"/>
+                <w:kern w:val="0"/>
+                <w:sz w:val="22"/>
+                <w:szCs w:val="22"/>
+                <w:lang w:val="en-PH" w:eastAsia="en-US" w:bidi="ar-SA"/>
+              </w:rPr>
+              <w:t>}</w:t>
+            </w:r>
+            <w:r>
+              <w:rPr>
+                <w:rFonts w:eastAsia="Arial" w:cs="Arial" w:ascii="Arial" w:hAnsi="Arial"/>
+                <w:i/>
+                <w:iCs/>
+                <w:color w:themeColor="text1" w:val="000000"/>
+                <w:kern w:val="0"/>
+                <w:sz w:val="22"/>
+                <w:szCs w:val="22"/>
+                <w:lang w:val="en-PH" w:eastAsia="en-US" w:bidi="ar-SA"/>
+              </w:rPr>
+              <w:t>}</w:t>
             </w:r>
           </w:p>
           <w:p>
@@ -2396,7 +3189,241 @@
                 <w:szCs w:val="22"/>
                 <w:lang w:val="en-PH" w:eastAsia="en-US" w:bidi="ar-SA"/>
               </w:rPr>
-              <w:t>[Date]</w:t>
+              <w:t>{</w:t>
+            </w:r>
+            <w:r>
+              <w:rPr>
+                <w:rFonts w:eastAsia="Arial" w:cs="Arial" w:ascii="Arial" w:hAnsi="Arial"/>
+                <w:i/>
+                <w:iCs/>
+                <w:color w:themeColor="text1" w:val="000000"/>
+                <w:kern w:val="0"/>
+                <w:sz w:val="22"/>
+                <w:szCs w:val="22"/>
+                <w:lang w:val="en-PH" w:eastAsia="en-US" w:bidi="ar-SA"/>
+              </w:rPr>
+              <w:t>{</w:t>
+            </w:r>
+            <w:r>
+              <w:rPr>
+                <w:rFonts w:eastAsia="Arial" w:cs="Arial" w:ascii="Arial" w:hAnsi="Arial"/>
+                <w:i/>
+                <w:iCs/>
+                <w:color w:themeColor="text1" w:val="000000"/>
+                <w:kern w:val="0"/>
+                <w:sz w:val="22"/>
+                <w:szCs w:val="22"/>
+                <w:lang w:val="en-PH" w:eastAsia="en-US" w:bidi="ar-SA"/>
+              </w:rPr>
+              <w:t>p</w:t>
+            </w:r>
+            <w:r>
+              <w:rPr>
+                <w:rFonts w:eastAsia="Arial" w:cs="Arial" w:ascii="Arial" w:hAnsi="Arial"/>
+                <w:i/>
+                <w:iCs/>
+                <w:color w:themeColor="text1" w:val="000000"/>
+                <w:kern w:val="0"/>
+                <w:sz w:val="22"/>
+                <w:szCs w:val="22"/>
+                <w:lang w:val="en-PH" w:eastAsia="en-US" w:bidi="ar-SA"/>
+              </w:rPr>
+              <w:t>r</w:t>
+            </w:r>
+            <w:r>
+              <w:rPr>
+                <w:rFonts w:eastAsia="Arial" w:cs="Arial" w:ascii="Arial" w:hAnsi="Arial"/>
+                <w:i/>
+                <w:iCs/>
+                <w:color w:themeColor="text1" w:val="000000"/>
+                <w:kern w:val="0"/>
+                <w:sz w:val="22"/>
+                <w:szCs w:val="22"/>
+                <w:lang w:val="en-PH" w:eastAsia="en-US" w:bidi="ar-SA"/>
+              </w:rPr>
+              <w:t>o</w:t>
+            </w:r>
+            <w:r>
+              <w:rPr>
+                <w:rFonts w:eastAsia="Arial" w:cs="Arial" w:ascii="Arial" w:hAnsi="Arial"/>
+                <w:i/>
+                <w:iCs/>
+                <w:color w:themeColor="text1" w:val="000000"/>
+                <w:kern w:val="0"/>
+                <w:sz w:val="22"/>
+                <w:szCs w:val="22"/>
+                <w:lang w:val="en-PH" w:eastAsia="en-US" w:bidi="ar-SA"/>
+              </w:rPr>
+              <w:t>p</w:t>
+            </w:r>
+            <w:r>
+              <w:rPr>
+                <w:rFonts w:eastAsia="Arial" w:cs="Arial" w:ascii="Arial" w:hAnsi="Arial"/>
+                <w:i/>
+                <w:iCs/>
+                <w:color w:themeColor="text1" w:val="000000"/>
+                <w:kern w:val="0"/>
+                <w:sz w:val="22"/>
+                <w:szCs w:val="22"/>
+                <w:lang w:val="en-PH" w:eastAsia="en-US" w:bidi="ar-SA"/>
+              </w:rPr>
+              <w:t>r</w:t>
+            </w:r>
+            <w:r>
+              <w:rPr>
+                <w:rFonts w:eastAsia="Arial" w:cs="Arial" w:ascii="Arial" w:hAnsi="Arial"/>
+                <w:i/>
+                <w:iCs/>
+                <w:color w:themeColor="text1" w:val="000000"/>
+                <w:kern w:val="0"/>
+                <w:sz w:val="22"/>
+                <w:szCs w:val="22"/>
+                <w:lang w:val="en-PH" w:eastAsia="en-US" w:bidi="ar-SA"/>
+              </w:rPr>
+              <w:t>i</w:t>
+            </w:r>
+            <w:r>
+              <w:rPr>
+                <w:rFonts w:eastAsia="Arial" w:cs="Arial" w:ascii="Arial" w:hAnsi="Arial"/>
+                <w:i/>
+                <w:iCs/>
+                <w:color w:themeColor="text1" w:val="000000"/>
+                <w:kern w:val="0"/>
+                <w:sz w:val="22"/>
+                <w:szCs w:val="22"/>
+                <w:lang w:val="en-PH" w:eastAsia="en-US" w:bidi="ar-SA"/>
+              </w:rPr>
+              <w:t>e</w:t>
+            </w:r>
+            <w:r>
+              <w:rPr>
+                <w:rFonts w:eastAsia="Arial" w:cs="Arial" w:ascii="Arial" w:hAnsi="Arial"/>
+                <w:i/>
+                <w:iCs/>
+                <w:color w:themeColor="text1" w:val="000000"/>
+                <w:kern w:val="0"/>
+                <w:sz w:val="22"/>
+                <w:szCs w:val="22"/>
+                <w:lang w:val="en-PH" w:eastAsia="en-US" w:bidi="ar-SA"/>
+              </w:rPr>
+              <w:t>t</w:t>
+            </w:r>
+            <w:r>
+              <w:rPr>
+                <w:rFonts w:eastAsia="Arial" w:cs="Arial" w:ascii="Arial" w:hAnsi="Arial"/>
+                <w:i/>
+                <w:iCs/>
+                <w:color w:themeColor="text1" w:val="000000"/>
+                <w:kern w:val="0"/>
+                <w:sz w:val="22"/>
+                <w:szCs w:val="22"/>
+                <w:lang w:val="en-PH" w:eastAsia="en-US" w:bidi="ar-SA"/>
+              </w:rPr>
+              <w:t>o</w:t>
+            </w:r>
+            <w:r>
+              <w:rPr>
+                <w:rFonts w:eastAsia="Arial" w:cs="Arial" w:ascii="Arial" w:hAnsi="Arial"/>
+                <w:i/>
+                <w:iCs/>
+                <w:color w:themeColor="text1" w:val="000000"/>
+                <w:kern w:val="0"/>
+                <w:sz w:val="22"/>
+                <w:szCs w:val="22"/>
+                <w:lang w:val="en-PH" w:eastAsia="en-US" w:bidi="ar-SA"/>
+              </w:rPr>
+              <w:t>r</w:t>
+            </w:r>
+            <w:r>
+              <w:rPr>
+                <w:rFonts w:eastAsia="Arial" w:cs="Arial" w:ascii="Arial" w:hAnsi="Arial"/>
+                <w:i/>
+                <w:iCs/>
+                <w:color w:themeColor="text1" w:val="000000"/>
+                <w:kern w:val="0"/>
+                <w:sz w:val="22"/>
+                <w:szCs w:val="22"/>
+                <w:lang w:val="en-PH" w:eastAsia="en-US" w:bidi="ar-SA"/>
+              </w:rPr>
+              <w:t>_</w:t>
+            </w:r>
+            <w:r>
+              <w:rPr>
+                <w:rFonts w:eastAsia="Arial" w:cs="Arial" w:ascii="Arial" w:hAnsi="Arial"/>
+                <w:i/>
+                <w:iCs/>
+                <w:color w:themeColor="text1" w:val="000000"/>
+                <w:kern w:val="0"/>
+                <w:sz w:val="22"/>
+                <w:szCs w:val="22"/>
+                <w:lang w:val="en-PH" w:eastAsia="en-US" w:bidi="ar-SA"/>
+              </w:rPr>
+              <w:t>d</w:t>
+            </w:r>
+            <w:r>
+              <w:rPr>
+                <w:rFonts w:eastAsia="Arial" w:cs="Arial" w:ascii="Arial" w:hAnsi="Arial"/>
+                <w:i/>
+                <w:iCs/>
+                <w:color w:themeColor="text1" w:val="000000"/>
+                <w:kern w:val="0"/>
+                <w:sz w:val="22"/>
+                <w:szCs w:val="22"/>
+                <w:lang w:val="en-PH" w:eastAsia="en-US" w:bidi="ar-SA"/>
+              </w:rPr>
+              <w:t>a</w:t>
+            </w:r>
+            <w:r>
+              <w:rPr>
+                <w:rFonts w:eastAsia="Arial" w:cs="Arial" w:ascii="Arial" w:hAnsi="Arial"/>
+                <w:i/>
+                <w:iCs/>
+                <w:color w:themeColor="text1" w:val="000000"/>
+                <w:kern w:val="0"/>
+                <w:sz w:val="22"/>
+                <w:szCs w:val="22"/>
+                <w:lang w:val="en-PH" w:eastAsia="en-US" w:bidi="ar-SA"/>
+              </w:rPr>
+              <w:t>t</w:t>
+            </w:r>
+            <w:r>
+              <w:rPr>
+                <w:rFonts w:eastAsia="Arial" w:cs="Arial" w:ascii="Arial" w:hAnsi="Arial"/>
+                <w:i/>
+                <w:iCs/>
+                <w:color w:themeColor="text1" w:val="000000"/>
+                <w:kern w:val="0"/>
+                <w:sz w:val="22"/>
+                <w:szCs w:val="22"/>
+                <w:lang w:val="en-PH" w:eastAsia="en-US" w:bidi="ar-SA"/>
+              </w:rPr>
+              <w:t>e</w:t>
+            </w:r>
+            <w:r>
+              <w:rPr>
+                <w:rFonts w:eastAsia="Arial" w:cs="Arial" w:ascii="Arial" w:hAnsi="Arial"/>
+                <w:i/>
+                <w:iCs/>
+                <w:color w:themeColor="text1" w:val="000000"/>
+                <w:kern w:val="0"/>
+                <w:sz w:val="22"/>
+                <w:szCs w:val="22"/>
+                <w:lang w:val="en-PH" w:eastAsia="en-US" w:bidi="ar-SA"/>
+              </w:rPr>
+              <w:t>}</w:t>
+            </w:r>
+            <w:r>
+              <w:rPr>
+                <w:rFonts w:eastAsia="Arial" w:cs="Arial" w:ascii="Arial" w:hAnsi="Arial"/>
+                <w:i/>
+                <w:iCs/>
+                <w:color w:themeColor="text1" w:val="000000"/>
+                <w:kern w:val="0"/>
+                <w:sz w:val="22"/>
+                <w:szCs w:val="22"/>
+                <w:lang w:val="en-PH" w:eastAsia="en-US" w:bidi="ar-SA"/>
+              </w:rPr>
+              <w:t>}</w:t>
             </w:r>
           </w:p>
           <w:p>
@@ -2507,7 +3534,7 @@
                 <w:szCs w:val="22"/>
                 <w:lang w:val="en-PH" w:bidi="ar-SA"/>
               </w:rPr>
-              <w:t>[Name and Signature]</w:t>
+              <w:t>{{entity_name_upper}}</w:t>
             </w:r>
           </w:p>
           <w:p>
@@ -2589,7 +3616,7 @@
                 <w:szCs w:val="22"/>
                 <w:lang w:val="en-PH" w:bidi="ar-SA"/>
               </w:rPr>
-              <w:t>[Name and Signature]</w:t>
+              <w:t>{{proprietor_upper}}</w:t>
             </w:r>
           </w:p>
           <w:p>

</xml_diff>

<commit_message>
integrate dynamic display of bullet based on user selection in radio input for procurement mode
</commit_message>
<xml_diff>
--- a/public/docs/NGPA_Contract-Form.docx
+++ b/public/docs/NGPA_Contract-Form.docx
@@ -231,21 +231,7 @@
           <w:i/>
           <w:iCs/>
         </w:rPr>
-        <w:t>{{entity_name</w:t>
-      </w:r>
-      <w:r>
-        <w:rPr>
-          <w:i/>
-          <w:iCs/>
-        </w:rPr>
-        <w:t>_upper</w:t>
-      </w:r>
-      <w:r>
-        <w:rPr>
-          <w:i/>
-          <w:iCs/>
-        </w:rPr>
-        <w:t>}}</w:t>
+        <w:t>{{entity_name_upper}}</w:t>
       </w:r>
       <w:r>
         <w:rPr/>
@@ -525,6 +511,7 @@
       </w:pPr>
       <w:r>
         <w:rPr/>
+        <w:t>{{#if_goods_start}}</w:t>
       </w:r>
     </w:p>
     <w:p>
@@ -737,13 +724,45 @@
         <w:pStyle w:val="ListParagraph"/>
         <w:widowControl w:val="false"/>
         <w:spacing w:before="240" w:after="240"/>
-        <w:ind w:start="1440"/>
-        <w:contextualSpacing/>
-        <w:jc w:val="both"/>
-        <w:rPr/>
-      </w:pPr>
-      <w:r>
-        <w:rPr/>
+        <w:ind w:hanging="0" w:start="0"/>
+        <w:contextualSpacing/>
+        <w:jc w:val="both"/>
+        <w:rPr/>
+      </w:pPr>
+      <w:r>
+        <w:rPr/>
+        <w:tab/>
+        <w:t>{{#if_goods_end}}</w:t>
+      </w:r>
+    </w:p>
+    <w:p>
+      <w:pPr>
+        <w:pStyle w:val="ListParagraph"/>
+        <w:widowControl w:val="false"/>
+        <w:spacing w:before="240" w:after="240"/>
+        <w:ind w:hanging="0" w:start="0"/>
+        <w:contextualSpacing/>
+        <w:jc w:val="both"/>
+        <w:rPr/>
+      </w:pPr>
+      <w:r>
+        <w:rPr/>
+      </w:r>
+    </w:p>
+    <w:p>
+      <w:pPr>
+        <w:pStyle w:val="ListParagraph"/>
+        <w:widowControl w:val="false"/>
+        <w:spacing w:before="240" w:after="240"/>
+        <w:ind w:hanging="0" w:start="0"/>
+        <w:contextualSpacing/>
+        <w:jc w:val="both"/>
+        <w:rPr/>
+      </w:pPr>
+      <w:r>
+        <w:rPr/>
+        <w:tab/>
+        <w:t>{{#if_infra_start}}</w:t>
       </w:r>
     </w:p>
     <w:p>
@@ -980,17 +999,57 @@
         <w:pStyle w:val="ListParagraph"/>
         <w:widowControl w:val="false"/>
         <w:spacing w:before="240" w:after="0"/>
-        <w:ind w:start="1440"/>
-        <w:contextualSpacing/>
-        <w:jc w:val="both"/>
-        <w:rPr>
-          <w:color w:themeColor="text1" w:val="000000"/>
-        </w:rPr>
-      </w:pPr>
-      <w:r>
-        <w:rPr>
-          <w:color w:themeColor="text1" w:val="000000"/>
-        </w:rPr>
+        <w:ind w:hanging="0" w:start="0"/>
+        <w:contextualSpacing/>
+        <w:jc w:val="both"/>
+        <w:rPr>
+          <w:color w:themeColor="text1" w:val="000000"/>
+        </w:rPr>
+      </w:pPr>
+      <w:r>
+        <w:rPr>
+          <w:color w:themeColor="text1" w:val="000000"/>
+        </w:rPr>
+        <w:tab/>
+        <w:t>{{#if_infra_end}}</w:t>
+      </w:r>
+    </w:p>
+    <w:p>
+      <w:pPr>
+        <w:pStyle w:val="ListParagraph"/>
+        <w:widowControl w:val="false"/>
+        <w:spacing w:before="240" w:after="0"/>
+        <w:ind w:hanging="0" w:start="0"/>
+        <w:contextualSpacing/>
+        <w:jc w:val="both"/>
+        <w:rPr>
+          <w:color w:themeColor="text1" w:val="000000"/>
+        </w:rPr>
+      </w:pPr>
+      <w:r>
+        <w:rPr>
+          <w:color w:themeColor="text1" w:val="000000"/>
+        </w:rPr>
+      </w:r>
+    </w:p>
+    <w:p>
+      <w:pPr>
+        <w:pStyle w:val="ListParagraph"/>
+        <w:widowControl w:val="false"/>
+        <w:spacing w:before="240" w:after="0"/>
+        <w:ind w:hanging="0" w:start="0"/>
+        <w:contextualSpacing/>
+        <w:jc w:val="both"/>
+        <w:rPr>
+          <w:color w:themeColor="text1" w:val="000000"/>
+        </w:rPr>
+      </w:pPr>
+      <w:r>
+        <w:rPr>
+          <w:color w:themeColor="text1" w:val="000000"/>
+        </w:rPr>
+        <w:tab/>
+        <w:t>{{#if_consulting_start}}</w:t>
       </w:r>
     </w:p>
     <w:p>
@@ -1269,7 +1328,30 @@
     <w:p>
       <w:pPr>
         <w:pStyle w:val="ListParagraph"/>
-        <w:ind w:start="1800"/>
+        <w:ind w:hanging="0" w:start="0"/>
+        <w:jc w:val="both"/>
+        <w:rPr>
+          <w:rFonts w:ascii="Times New Roman" w:hAnsi="Times New Roman" w:eastAsia="Times New Roman" w:cs="Times New Roman"/>
+          <w:color w:themeColor="text1" w:val="000000"/>
+          <w:sz w:val="24"/>
+          <w:szCs w:val="24"/>
+        </w:rPr>
+      </w:pPr>
+      <w:r>
+        <w:rPr>
+          <w:rFonts w:eastAsia="Times New Roman" w:cs="Times New Roman" w:ascii="Times New Roman" w:hAnsi="Times New Roman"/>
+          <w:color w:themeColor="text1" w:val="000000"/>
+          <w:sz w:val="24"/>
+          <w:szCs w:val="24"/>
+        </w:rPr>
+        <w:tab/>
+        <w:t>{{#if_consulting_end}}</w:t>
+      </w:r>
+    </w:p>
+    <w:p>
+      <w:pPr>
+        <w:pStyle w:val="ListParagraph"/>
+        <w:ind w:hanging="0" w:start="0"/>
         <w:jc w:val="both"/>
         <w:rPr>
           <w:rFonts w:ascii="Times New Roman" w:hAnsi="Times New Roman" w:eastAsia="Times New Roman" w:cs="Times New Roman"/>
@@ -1507,21 +1589,7 @@
           <w:i/>
           <w:iCs/>
         </w:rPr>
-        <w:t>{{entity_name</w:t>
-      </w:r>
-      <w:r>
-        <w:rPr>
-          <w:i/>
-          <w:iCs/>
-        </w:rPr>
-        <w:t>_upper</w:t>
-      </w:r>
-      <w:r>
-        <w:rPr>
-          <w:i/>
-          <w:iCs/>
-        </w:rPr>
-        <w:t>}}</w:t>
+        <w:t>{{entity_name_upper}}</w:t>
       </w:r>
       <w:r>
         <w:rPr/>
@@ -1852,31 +1920,7 @@
                 <w:szCs w:val="22"/>
                 <w:lang w:val="en-PH" w:bidi="ar-SA"/>
               </w:rPr>
-              <w:t>{{entity_name</w:t>
-            </w:r>
-            <w:r>
-              <w:rPr>
-                <w:i/>
-                <w:iCs/>
-                <w:color w:themeColor="text1" w:val="000000"/>
-                <w:kern w:val="0"/>
-                <w:sz w:val="22"/>
-                <w:szCs w:val="22"/>
-                <w:lang w:val="en-PH" w:bidi="ar-SA"/>
-              </w:rPr>
-              <w:t>_upper</w:t>
-            </w:r>
-            <w:r>
-              <w:rPr>
-                <w:i/>
-                <w:iCs/>
-                <w:color w:themeColor="text1" w:val="000000"/>
-                <w:kern w:val="0"/>
-                <w:sz w:val="22"/>
-                <w:szCs w:val="22"/>
-                <w:lang w:val="en-PH" w:bidi="ar-SA"/>
-              </w:rPr>
-              <w:t>}}</w:t>
+              <w:t>{{entity_name_upper}}</w:t>
             </w:r>
           </w:p>
           <w:p>
@@ -1902,397 +1946,7 @@
                 <w:szCs w:val="22"/>
                 <w:lang w:val="en-PH" w:eastAsia="en-US" w:bidi="ar-SA"/>
               </w:rPr>
-              <w:t>{</w:t>
-            </w:r>
-            <w:r>
-              <w:rPr>
-                <w:rFonts w:eastAsia="Arial" w:cs="Arial" w:ascii="Arial" w:hAnsi="Arial"/>
-                <w:i/>
-                <w:iCs/>
-                <w:color w:themeColor="text1" w:val="000000"/>
-                <w:kern w:val="0"/>
-                <w:sz w:val="22"/>
-                <w:szCs w:val="22"/>
-                <w:lang w:val="en-PH" w:eastAsia="en-US" w:bidi="ar-SA"/>
-              </w:rPr>
-              <w:t>{</w:t>
-            </w:r>
-            <w:r>
-              <w:rPr>
-                <w:rFonts w:eastAsia="Arial" w:cs="Arial" w:ascii="Arial" w:hAnsi="Arial"/>
-                <w:i/>
-                <w:iCs/>
-                <w:color w:themeColor="text1" w:val="000000"/>
-                <w:kern w:val="0"/>
-                <w:sz w:val="22"/>
-                <w:szCs w:val="22"/>
-                <w:lang w:val="en-PH" w:eastAsia="en-US" w:bidi="ar-SA"/>
-              </w:rPr>
-              <w:t>e</w:t>
-            </w:r>
-            <w:r>
-              <w:rPr>
-                <w:rFonts w:eastAsia="Arial" w:cs="Arial" w:ascii="Arial" w:hAnsi="Arial"/>
-                <w:i/>
-                <w:iCs/>
-                <w:color w:themeColor="text1" w:val="000000"/>
-                <w:kern w:val="0"/>
-                <w:sz w:val="22"/>
-                <w:szCs w:val="22"/>
-                <w:lang w:val="en-PH" w:eastAsia="en-US" w:bidi="ar-SA"/>
-              </w:rPr>
-              <w:t>n</w:t>
-            </w:r>
-            <w:r>
-              <w:rPr>
-                <w:rFonts w:eastAsia="Arial" w:cs="Arial" w:ascii="Arial" w:hAnsi="Arial"/>
-                <w:i/>
-                <w:iCs/>
-                <w:color w:themeColor="text1" w:val="000000"/>
-                <w:kern w:val="0"/>
-                <w:sz w:val="22"/>
-                <w:szCs w:val="22"/>
-                <w:lang w:val="en-PH" w:eastAsia="en-US" w:bidi="ar-SA"/>
-              </w:rPr>
-              <w:t>t</w:t>
-            </w:r>
-            <w:r>
-              <w:rPr>
-                <w:rFonts w:eastAsia="Arial" w:cs="Arial" w:ascii="Arial" w:hAnsi="Arial"/>
-                <w:i/>
-                <w:iCs/>
-                <w:color w:themeColor="text1" w:val="000000"/>
-                <w:kern w:val="0"/>
-                <w:sz w:val="22"/>
-                <w:szCs w:val="22"/>
-                <w:lang w:val="en-PH" w:eastAsia="en-US" w:bidi="ar-SA"/>
-              </w:rPr>
-              <w:t>i</w:t>
-            </w:r>
-            <w:r>
-              <w:rPr>
-                <w:rFonts w:eastAsia="Arial" w:cs="Arial" w:ascii="Arial" w:hAnsi="Arial"/>
-                <w:i/>
-                <w:iCs/>
-                <w:color w:themeColor="text1" w:val="000000"/>
-                <w:kern w:val="0"/>
-                <w:sz w:val="22"/>
-                <w:szCs w:val="22"/>
-                <w:lang w:val="en-PH" w:eastAsia="en-US" w:bidi="ar-SA"/>
-              </w:rPr>
-              <w:t>t</w:t>
-            </w:r>
-            <w:r>
-              <w:rPr>
-                <w:rFonts w:eastAsia="Arial" w:cs="Arial" w:ascii="Arial" w:hAnsi="Arial"/>
-                <w:i/>
-                <w:iCs/>
-                <w:color w:themeColor="text1" w:val="000000"/>
-                <w:kern w:val="0"/>
-                <w:sz w:val="22"/>
-                <w:szCs w:val="22"/>
-                <w:lang w:val="en-PH" w:eastAsia="en-US" w:bidi="ar-SA"/>
-              </w:rPr>
-              <w:t>y</w:t>
-            </w:r>
-            <w:r>
-              <w:rPr>
-                <w:rFonts w:eastAsia="Arial" w:cs="Arial" w:ascii="Arial" w:hAnsi="Arial"/>
-                <w:i/>
-                <w:iCs/>
-                <w:color w:themeColor="text1" w:val="000000"/>
-                <w:kern w:val="0"/>
-                <w:sz w:val="22"/>
-                <w:szCs w:val="22"/>
-                <w:lang w:val="en-PH" w:eastAsia="en-US" w:bidi="ar-SA"/>
-              </w:rPr>
-              <w:t>_</w:t>
-            </w:r>
-            <w:r>
-              <w:rPr>
-                <w:rFonts w:eastAsia="Arial" w:cs="Arial" w:ascii="Arial" w:hAnsi="Arial"/>
-                <w:i/>
-                <w:iCs/>
-                <w:color w:themeColor="text1" w:val="000000"/>
-                <w:kern w:val="0"/>
-                <w:sz w:val="22"/>
-                <w:szCs w:val="22"/>
-                <w:lang w:val="en-PH" w:eastAsia="en-US" w:bidi="ar-SA"/>
-              </w:rPr>
-              <w:t>p</w:t>
-            </w:r>
-            <w:r>
-              <w:rPr>
-                <w:rFonts w:eastAsia="Arial" w:cs="Arial" w:ascii="Arial" w:hAnsi="Arial"/>
-                <w:i/>
-                <w:iCs/>
-                <w:color w:themeColor="text1" w:val="000000"/>
-                <w:kern w:val="0"/>
-                <w:sz w:val="22"/>
-                <w:szCs w:val="22"/>
-                <w:lang w:val="en-PH" w:eastAsia="en-US" w:bidi="ar-SA"/>
-              </w:rPr>
-              <w:t>o</w:t>
-            </w:r>
-            <w:r>
-              <w:rPr>
-                <w:rFonts w:eastAsia="Arial" w:cs="Arial" w:ascii="Arial" w:hAnsi="Arial"/>
-                <w:i/>
-                <w:iCs/>
-                <w:color w:themeColor="text1" w:val="000000"/>
-                <w:kern w:val="0"/>
-                <w:sz w:val="22"/>
-                <w:szCs w:val="22"/>
-                <w:lang w:val="en-PH" w:eastAsia="en-US" w:bidi="ar-SA"/>
-              </w:rPr>
-              <w:t>s</w:t>
-            </w:r>
-            <w:r>
-              <w:rPr>
-                <w:rFonts w:eastAsia="Arial" w:cs="Arial" w:ascii="Arial" w:hAnsi="Arial"/>
-                <w:i/>
-                <w:iCs/>
-                <w:color w:themeColor="text1" w:val="000000"/>
-                <w:kern w:val="0"/>
-                <w:sz w:val="22"/>
-                <w:szCs w:val="22"/>
-                <w:lang w:val="en-PH" w:eastAsia="en-US" w:bidi="ar-SA"/>
-              </w:rPr>
-              <w:t>i</w:t>
-            </w:r>
-            <w:r>
-              <w:rPr>
-                <w:rFonts w:eastAsia="Arial" w:cs="Arial" w:ascii="Arial" w:hAnsi="Arial"/>
-                <w:i/>
-                <w:iCs/>
-                <w:color w:themeColor="text1" w:val="000000"/>
-                <w:kern w:val="0"/>
-                <w:sz w:val="22"/>
-                <w:szCs w:val="22"/>
-                <w:lang w:val="en-PH" w:eastAsia="en-US" w:bidi="ar-SA"/>
-              </w:rPr>
-              <w:t>t</w:t>
-            </w:r>
-            <w:r>
-              <w:rPr>
-                <w:rFonts w:eastAsia="Arial" w:cs="Arial" w:ascii="Arial" w:hAnsi="Arial"/>
-                <w:i/>
-                <w:iCs/>
-                <w:color w:themeColor="text1" w:val="000000"/>
-                <w:kern w:val="0"/>
-                <w:sz w:val="22"/>
-                <w:szCs w:val="22"/>
-                <w:lang w:val="en-PH" w:eastAsia="en-US" w:bidi="ar-SA"/>
-              </w:rPr>
-              <w:t>i</w:t>
-            </w:r>
-            <w:r>
-              <w:rPr>
-                <w:rFonts w:eastAsia="Arial" w:cs="Arial" w:ascii="Arial" w:hAnsi="Arial"/>
-                <w:i/>
-                <w:iCs/>
-                <w:color w:themeColor="text1" w:val="000000"/>
-                <w:kern w:val="0"/>
-                <w:sz w:val="22"/>
-                <w:szCs w:val="22"/>
-                <w:lang w:val="en-PH" w:eastAsia="en-US" w:bidi="ar-SA"/>
-              </w:rPr>
-              <w:t>o</w:t>
-            </w:r>
-            <w:r>
-              <w:rPr>
-                <w:rFonts w:eastAsia="Arial" w:cs="Arial" w:ascii="Arial" w:hAnsi="Arial"/>
-                <w:i/>
-                <w:iCs/>
-                <w:color w:themeColor="text1" w:val="000000"/>
-                <w:kern w:val="0"/>
-                <w:sz w:val="22"/>
-                <w:szCs w:val="22"/>
-                <w:lang w:val="en-PH" w:eastAsia="en-US" w:bidi="ar-SA"/>
-              </w:rPr>
-              <w:t>n</w:t>
-            </w:r>
-            <w:r>
-              <w:rPr>
-                <w:rFonts w:eastAsia="Arial" w:cs="Arial" w:ascii="Arial" w:hAnsi="Arial"/>
-                <w:i/>
-                <w:iCs/>
-                <w:color w:themeColor="text1" w:val="000000"/>
-                <w:kern w:val="0"/>
-                <w:sz w:val="22"/>
-                <w:szCs w:val="22"/>
-                <w:lang w:val="en-PH" w:eastAsia="en-US" w:bidi="ar-SA"/>
-              </w:rPr>
-              <w:t>_</w:t>
-            </w:r>
-            <w:r>
-              <w:rPr>
-                <w:rFonts w:eastAsia="Arial" w:cs="Arial" w:ascii="Arial" w:hAnsi="Arial"/>
-                <w:i/>
-                <w:iCs/>
-                <w:color w:themeColor="text1" w:val="000000"/>
-                <w:kern w:val="0"/>
-                <w:sz w:val="22"/>
-                <w:szCs w:val="22"/>
-                <w:lang w:val="en-PH" w:eastAsia="en-US" w:bidi="ar-SA"/>
-              </w:rPr>
-              <w:t>d</w:t>
-            </w:r>
-            <w:r>
-              <w:rPr>
-                <w:rFonts w:eastAsia="Arial" w:cs="Arial" w:ascii="Arial" w:hAnsi="Arial"/>
-                <w:i/>
-                <w:iCs/>
-                <w:color w:themeColor="text1" w:val="000000"/>
-                <w:kern w:val="0"/>
-                <w:sz w:val="22"/>
-                <w:szCs w:val="22"/>
-                <w:lang w:val="en-PH" w:eastAsia="en-US" w:bidi="ar-SA"/>
-              </w:rPr>
-              <w:t>e</w:t>
-            </w:r>
-            <w:r>
-              <w:rPr>
-                <w:rFonts w:eastAsia="Arial" w:cs="Arial" w:ascii="Arial" w:hAnsi="Arial"/>
-                <w:i/>
-                <w:iCs/>
-                <w:color w:themeColor="text1" w:val="000000"/>
-                <w:kern w:val="0"/>
-                <w:sz w:val="22"/>
-                <w:szCs w:val="22"/>
-                <w:lang w:val="en-PH" w:eastAsia="en-US" w:bidi="ar-SA"/>
-              </w:rPr>
-              <w:t>s</w:t>
-            </w:r>
-            <w:r>
-              <w:rPr>
-                <w:rFonts w:eastAsia="Arial" w:cs="Arial" w:ascii="Arial" w:hAnsi="Arial"/>
-                <w:i/>
-                <w:iCs/>
-                <w:color w:themeColor="text1" w:val="000000"/>
-                <w:kern w:val="0"/>
-                <w:sz w:val="22"/>
-                <w:szCs w:val="22"/>
-                <w:lang w:val="en-PH" w:eastAsia="en-US" w:bidi="ar-SA"/>
-              </w:rPr>
-              <w:t>i</w:t>
-            </w:r>
-            <w:r>
-              <w:rPr>
-                <w:rFonts w:eastAsia="Arial" w:cs="Arial" w:ascii="Arial" w:hAnsi="Arial"/>
-                <w:i/>
-                <w:iCs/>
-                <w:color w:themeColor="text1" w:val="000000"/>
-                <w:kern w:val="0"/>
-                <w:sz w:val="22"/>
-                <w:szCs w:val="22"/>
-                <w:lang w:val="en-PH" w:eastAsia="en-US" w:bidi="ar-SA"/>
-              </w:rPr>
-              <w:t>g</w:t>
-            </w:r>
-            <w:r>
-              <w:rPr>
-                <w:rFonts w:eastAsia="Arial" w:cs="Arial" w:ascii="Arial" w:hAnsi="Arial"/>
-                <w:i/>
-                <w:iCs/>
-                <w:color w:themeColor="text1" w:val="000000"/>
-                <w:kern w:val="0"/>
-                <w:sz w:val="22"/>
-                <w:szCs w:val="22"/>
-                <w:lang w:val="en-PH" w:eastAsia="en-US" w:bidi="ar-SA"/>
-              </w:rPr>
-              <w:t>n</w:t>
-            </w:r>
-            <w:r>
-              <w:rPr>
-                <w:rFonts w:eastAsia="Arial" w:cs="Arial" w:ascii="Arial" w:hAnsi="Arial"/>
-                <w:i/>
-                <w:iCs/>
-                <w:color w:themeColor="text1" w:val="000000"/>
-                <w:kern w:val="0"/>
-                <w:sz w:val="22"/>
-                <w:szCs w:val="22"/>
-                <w:lang w:val="en-PH" w:eastAsia="en-US" w:bidi="ar-SA"/>
-              </w:rPr>
-              <w:t>a</w:t>
-            </w:r>
-            <w:r>
-              <w:rPr>
-                <w:rFonts w:eastAsia="Arial" w:cs="Arial" w:ascii="Arial" w:hAnsi="Arial"/>
-                <w:i/>
-                <w:iCs/>
-                <w:color w:themeColor="text1" w:val="000000"/>
-                <w:kern w:val="0"/>
-                <w:sz w:val="22"/>
-                <w:szCs w:val="22"/>
-                <w:lang w:val="en-PH" w:eastAsia="en-US" w:bidi="ar-SA"/>
-              </w:rPr>
-              <w:t>t</w:t>
-            </w:r>
-            <w:r>
-              <w:rPr>
-                <w:rFonts w:eastAsia="Arial" w:cs="Arial" w:ascii="Arial" w:hAnsi="Arial"/>
-                <w:i/>
-                <w:iCs/>
-                <w:color w:themeColor="text1" w:val="000000"/>
-                <w:kern w:val="0"/>
-                <w:sz w:val="22"/>
-                <w:szCs w:val="22"/>
-                <w:lang w:val="en-PH" w:eastAsia="en-US" w:bidi="ar-SA"/>
-              </w:rPr>
-              <w:t>i</w:t>
-            </w:r>
-            <w:r>
-              <w:rPr>
-                <w:rFonts w:eastAsia="Arial" w:cs="Arial" w:ascii="Arial" w:hAnsi="Arial"/>
-                <w:i/>
-                <w:iCs/>
-                <w:color w:themeColor="text1" w:val="000000"/>
-                <w:kern w:val="0"/>
-                <w:sz w:val="22"/>
-                <w:szCs w:val="22"/>
-                <w:lang w:val="en-PH" w:eastAsia="en-US" w:bidi="ar-SA"/>
-              </w:rPr>
-              <w:t>o</w:t>
-            </w:r>
-            <w:r>
-              <w:rPr>
-                <w:rFonts w:eastAsia="Arial" w:cs="Arial" w:ascii="Arial" w:hAnsi="Arial"/>
-                <w:i/>
-                <w:iCs/>
-                <w:color w:themeColor="text1" w:val="000000"/>
-                <w:kern w:val="0"/>
-                <w:sz w:val="22"/>
-                <w:szCs w:val="22"/>
-                <w:lang w:val="en-PH" w:eastAsia="en-US" w:bidi="ar-SA"/>
-              </w:rPr>
-              <w:t>n</w:t>
-            </w:r>
-            <w:r>
-              <w:rPr>
-                <w:rFonts w:eastAsia="Arial" w:cs="Arial" w:ascii="Arial" w:hAnsi="Arial"/>
-                <w:i/>
-                <w:iCs/>
-                <w:color w:themeColor="text1" w:val="000000"/>
-                <w:kern w:val="0"/>
-                <w:sz w:val="22"/>
-                <w:szCs w:val="22"/>
-                <w:lang w:val="en-PH" w:eastAsia="en-US" w:bidi="ar-SA"/>
-              </w:rPr>
-              <w:t>}</w:t>
-            </w:r>
-            <w:r>
-              <w:rPr>
-                <w:rFonts w:eastAsia="Arial" w:cs="Arial" w:ascii="Arial" w:hAnsi="Arial"/>
-                <w:i/>
-                <w:iCs/>
-                <w:color w:themeColor="text1" w:val="000000"/>
-                <w:kern w:val="0"/>
-                <w:sz w:val="22"/>
-                <w:szCs w:val="22"/>
-                <w:lang w:val="en-PH" w:eastAsia="en-US" w:bidi="ar-SA"/>
-              </w:rPr>
-              <w:t>}</w:t>
+              <w:t>{{entity_position_designation}}</w:t>
             </w:r>
           </w:p>
           <w:p>
@@ -2318,189 +1972,7 @@
                 <w:szCs w:val="22"/>
                 <w:lang w:val="en-PH" w:eastAsia="en-US" w:bidi="ar-SA"/>
               </w:rPr>
-              <w:t>{</w:t>
-            </w:r>
-            <w:r>
-              <w:rPr>
-                <w:rFonts w:eastAsia="Arial" w:cs="Arial" w:ascii="Arial" w:hAnsi="Arial"/>
-                <w:i/>
-                <w:iCs/>
-                <w:color w:themeColor="text1" w:val="000000"/>
-                <w:kern w:val="0"/>
-                <w:sz w:val="22"/>
-                <w:szCs w:val="22"/>
-                <w:lang w:val="en-PH" w:eastAsia="en-US" w:bidi="ar-SA"/>
-              </w:rPr>
-              <w:t>{</w:t>
-            </w:r>
-            <w:r>
-              <w:rPr>
-                <w:rFonts w:eastAsia="Arial" w:cs="Arial" w:ascii="Arial" w:hAnsi="Arial"/>
-                <w:i/>
-                <w:iCs/>
-                <w:color w:themeColor="text1" w:val="000000"/>
-                <w:kern w:val="0"/>
-                <w:sz w:val="22"/>
-                <w:szCs w:val="22"/>
-                <w:lang w:val="en-PH" w:eastAsia="en-US" w:bidi="ar-SA"/>
-              </w:rPr>
-              <w:t>e</w:t>
-            </w:r>
-            <w:r>
-              <w:rPr>
-                <w:rFonts w:eastAsia="Arial" w:cs="Arial" w:ascii="Arial" w:hAnsi="Arial"/>
-                <w:i/>
-                <w:iCs/>
-                <w:color w:themeColor="text1" w:val="000000"/>
-                <w:kern w:val="0"/>
-                <w:sz w:val="22"/>
-                <w:szCs w:val="22"/>
-                <w:lang w:val="en-PH" w:eastAsia="en-US" w:bidi="ar-SA"/>
-              </w:rPr>
-              <w:t>n</w:t>
-            </w:r>
-            <w:r>
-              <w:rPr>
-                <w:rFonts w:eastAsia="Arial" w:cs="Arial" w:ascii="Arial" w:hAnsi="Arial"/>
-                <w:i/>
-                <w:iCs/>
-                <w:color w:themeColor="text1" w:val="000000"/>
-                <w:kern w:val="0"/>
-                <w:sz w:val="22"/>
-                <w:szCs w:val="22"/>
-                <w:lang w:val="en-PH" w:eastAsia="en-US" w:bidi="ar-SA"/>
-              </w:rPr>
-              <w:t>t</w:t>
-            </w:r>
-            <w:r>
-              <w:rPr>
-                <w:rFonts w:eastAsia="Arial" w:cs="Arial" w:ascii="Arial" w:hAnsi="Arial"/>
-                <w:i/>
-                <w:iCs/>
-                <w:color w:themeColor="text1" w:val="000000"/>
-                <w:kern w:val="0"/>
-                <w:sz w:val="22"/>
-                <w:szCs w:val="22"/>
-                <w:lang w:val="en-PH" w:eastAsia="en-US" w:bidi="ar-SA"/>
-              </w:rPr>
-              <w:t>i</w:t>
-            </w:r>
-            <w:r>
-              <w:rPr>
-                <w:rFonts w:eastAsia="Arial" w:cs="Arial" w:ascii="Arial" w:hAnsi="Arial"/>
-                <w:i/>
-                <w:iCs/>
-                <w:color w:themeColor="text1" w:val="000000"/>
-                <w:kern w:val="0"/>
-                <w:sz w:val="22"/>
-                <w:szCs w:val="22"/>
-                <w:lang w:val="en-PH" w:eastAsia="en-US" w:bidi="ar-SA"/>
-              </w:rPr>
-              <w:t>t</w:t>
-            </w:r>
-            <w:r>
-              <w:rPr>
-                <w:rFonts w:eastAsia="Arial" w:cs="Arial" w:ascii="Arial" w:hAnsi="Arial"/>
-                <w:i/>
-                <w:iCs/>
-                <w:color w:themeColor="text1" w:val="000000"/>
-                <w:kern w:val="0"/>
-                <w:sz w:val="22"/>
-                <w:szCs w:val="22"/>
-                <w:lang w:val="en-PH" w:eastAsia="en-US" w:bidi="ar-SA"/>
-              </w:rPr>
-              <w:t>y</w:t>
-            </w:r>
-            <w:r>
-              <w:rPr>
-                <w:rFonts w:eastAsia="Arial" w:cs="Arial" w:ascii="Arial" w:hAnsi="Arial"/>
-                <w:i/>
-                <w:iCs/>
-                <w:color w:themeColor="text1" w:val="000000"/>
-                <w:kern w:val="0"/>
-                <w:sz w:val="22"/>
-                <w:szCs w:val="22"/>
-                <w:lang w:val="en-PH" w:eastAsia="en-US" w:bidi="ar-SA"/>
-              </w:rPr>
-              <w:t>_</w:t>
-            </w:r>
-            <w:r>
-              <w:rPr>
-                <w:rFonts w:eastAsia="Arial" w:cs="Arial" w:ascii="Arial" w:hAnsi="Arial"/>
-                <w:i/>
-                <w:iCs/>
-                <w:color w:themeColor="text1" w:val="000000"/>
-                <w:kern w:val="0"/>
-                <w:sz w:val="22"/>
-                <w:szCs w:val="22"/>
-                <w:lang w:val="en-PH" w:eastAsia="en-US" w:bidi="ar-SA"/>
-              </w:rPr>
-              <w:t>d</w:t>
-            </w:r>
-            <w:r>
-              <w:rPr>
-                <w:rFonts w:eastAsia="Arial" w:cs="Arial" w:ascii="Arial" w:hAnsi="Arial"/>
-                <w:i/>
-                <w:iCs/>
-                <w:color w:themeColor="text1" w:val="000000"/>
-                <w:kern w:val="0"/>
-                <w:sz w:val="22"/>
-                <w:szCs w:val="22"/>
-                <w:lang w:val="en-PH" w:eastAsia="en-US" w:bidi="ar-SA"/>
-              </w:rPr>
-              <w:t>a</w:t>
-            </w:r>
-            <w:r>
-              <w:rPr>
-                <w:rFonts w:eastAsia="Arial" w:cs="Arial" w:ascii="Arial" w:hAnsi="Arial"/>
-                <w:i/>
-                <w:iCs/>
-                <w:color w:themeColor="text1" w:val="000000"/>
-                <w:kern w:val="0"/>
-                <w:sz w:val="22"/>
-                <w:szCs w:val="22"/>
-                <w:lang w:val="en-PH" w:eastAsia="en-US" w:bidi="ar-SA"/>
-              </w:rPr>
-              <w:t>t</w:t>
-            </w:r>
-            <w:r>
-              <w:rPr>
-                <w:rFonts w:eastAsia="Arial" w:cs="Arial" w:ascii="Arial" w:hAnsi="Arial"/>
-                <w:i/>
-                <w:iCs/>
-                <w:color w:themeColor="text1" w:val="000000"/>
-                <w:kern w:val="0"/>
-                <w:sz w:val="22"/>
-                <w:szCs w:val="22"/>
-                <w:lang w:val="en-PH" w:eastAsia="en-US" w:bidi="ar-SA"/>
-              </w:rPr>
-              <w:t>e</w:t>
-            </w:r>
-            <w:r>
-              <w:rPr>
-                <w:rFonts w:eastAsia="Arial" w:cs="Arial" w:ascii="Arial" w:hAnsi="Arial"/>
-                <w:i/>
-                <w:iCs/>
-                <w:color w:themeColor="text1" w:val="000000"/>
-                <w:kern w:val="0"/>
-                <w:sz w:val="22"/>
-                <w:szCs w:val="22"/>
-                <w:lang w:val="en-PH" w:eastAsia="en-US" w:bidi="ar-SA"/>
-              </w:rPr>
-              <w:t>}</w:t>
-            </w:r>
-            <w:r>
-              <w:rPr>
-                <w:rFonts w:eastAsia="Arial" w:cs="Arial" w:ascii="Arial" w:hAnsi="Arial"/>
-                <w:i/>
-                <w:iCs/>
-                <w:color w:themeColor="text1" w:val="000000"/>
-                <w:kern w:val="0"/>
-                <w:sz w:val="22"/>
-                <w:szCs w:val="22"/>
-                <w:lang w:val="en-PH" w:eastAsia="en-US" w:bidi="ar-SA"/>
-              </w:rPr>
-              <w:t>}</w:t>
+              <w:t>{{entity_date}}</w:t>
             </w:r>
           </w:p>
           <w:p>
@@ -2721,449 +2193,7 @@
                 <w:szCs w:val="22"/>
                 <w:lang w:val="en-PH" w:eastAsia="en-US" w:bidi="ar-SA"/>
               </w:rPr>
-              <w:t>{</w:t>
-            </w:r>
-            <w:r>
-              <w:rPr>
-                <w:rFonts w:eastAsia="Arial" w:cs="Arial" w:ascii="Arial" w:hAnsi="Arial"/>
-                <w:i/>
-                <w:iCs/>
-                <w:color w:themeColor="text1" w:val="000000"/>
-                <w:kern w:val="0"/>
-                <w:sz w:val="22"/>
-                <w:szCs w:val="22"/>
-                <w:lang w:val="en-PH" w:eastAsia="en-US" w:bidi="ar-SA"/>
-              </w:rPr>
-              <w:t>{</w:t>
-            </w:r>
-            <w:r>
-              <w:rPr>
-                <w:rFonts w:eastAsia="Arial" w:cs="Arial" w:ascii="Arial" w:hAnsi="Arial"/>
-                <w:i/>
-                <w:iCs/>
-                <w:color w:themeColor="text1" w:val="000000"/>
-                <w:kern w:val="0"/>
-                <w:sz w:val="22"/>
-                <w:szCs w:val="22"/>
-                <w:lang w:val="en-PH" w:eastAsia="en-US" w:bidi="ar-SA"/>
-              </w:rPr>
-              <w:t>p</w:t>
-            </w:r>
-            <w:r>
-              <w:rPr>
-                <w:rFonts w:eastAsia="Arial" w:cs="Arial" w:ascii="Arial" w:hAnsi="Arial"/>
-                <w:i/>
-                <w:iCs/>
-                <w:color w:themeColor="text1" w:val="000000"/>
-                <w:kern w:val="0"/>
-                <w:sz w:val="22"/>
-                <w:szCs w:val="22"/>
-                <w:lang w:val="en-PH" w:eastAsia="en-US" w:bidi="ar-SA"/>
-              </w:rPr>
-              <w:t>r</w:t>
-            </w:r>
-            <w:r>
-              <w:rPr>
-                <w:rFonts w:eastAsia="Arial" w:cs="Arial" w:ascii="Arial" w:hAnsi="Arial"/>
-                <w:i/>
-                <w:iCs/>
-                <w:color w:themeColor="text1" w:val="000000"/>
-                <w:kern w:val="0"/>
-                <w:sz w:val="22"/>
-                <w:szCs w:val="22"/>
-                <w:lang w:val="en-PH" w:eastAsia="en-US" w:bidi="ar-SA"/>
-              </w:rPr>
-              <w:t>o</w:t>
-            </w:r>
-            <w:r>
-              <w:rPr>
-                <w:rFonts w:eastAsia="Arial" w:cs="Arial" w:ascii="Arial" w:hAnsi="Arial"/>
-                <w:i/>
-                <w:iCs/>
-                <w:color w:themeColor="text1" w:val="000000"/>
-                <w:kern w:val="0"/>
-                <w:sz w:val="22"/>
-                <w:szCs w:val="22"/>
-                <w:lang w:val="en-PH" w:eastAsia="en-US" w:bidi="ar-SA"/>
-              </w:rPr>
-              <w:t>p</w:t>
-            </w:r>
-            <w:r>
-              <w:rPr>
-                <w:rFonts w:eastAsia="Arial" w:cs="Arial" w:ascii="Arial" w:hAnsi="Arial"/>
-                <w:i/>
-                <w:iCs/>
-                <w:color w:themeColor="text1" w:val="000000"/>
-                <w:kern w:val="0"/>
-                <w:sz w:val="22"/>
-                <w:szCs w:val="22"/>
-                <w:lang w:val="en-PH" w:eastAsia="en-US" w:bidi="ar-SA"/>
-              </w:rPr>
-              <w:t>r</w:t>
-            </w:r>
-            <w:r>
-              <w:rPr>
-                <w:rFonts w:eastAsia="Arial" w:cs="Arial" w:ascii="Arial" w:hAnsi="Arial"/>
-                <w:i/>
-                <w:iCs/>
-                <w:color w:themeColor="text1" w:val="000000"/>
-                <w:kern w:val="0"/>
-                <w:sz w:val="22"/>
-                <w:szCs w:val="22"/>
-                <w:lang w:val="en-PH" w:eastAsia="en-US" w:bidi="ar-SA"/>
-              </w:rPr>
-              <w:t>i</w:t>
-            </w:r>
-            <w:r>
-              <w:rPr>
-                <w:rFonts w:eastAsia="Arial" w:cs="Arial" w:ascii="Arial" w:hAnsi="Arial"/>
-                <w:i/>
-                <w:iCs/>
-                <w:color w:themeColor="text1" w:val="000000"/>
-                <w:kern w:val="0"/>
-                <w:sz w:val="22"/>
-                <w:szCs w:val="22"/>
-                <w:lang w:val="en-PH" w:eastAsia="en-US" w:bidi="ar-SA"/>
-              </w:rPr>
-              <w:t>e</w:t>
-            </w:r>
-            <w:r>
-              <w:rPr>
-                <w:rFonts w:eastAsia="Arial" w:cs="Arial" w:ascii="Arial" w:hAnsi="Arial"/>
-                <w:i/>
-                <w:iCs/>
-                <w:color w:themeColor="text1" w:val="000000"/>
-                <w:kern w:val="0"/>
-                <w:sz w:val="22"/>
-                <w:szCs w:val="22"/>
-                <w:lang w:val="en-PH" w:eastAsia="en-US" w:bidi="ar-SA"/>
-              </w:rPr>
-              <w:t>t</w:t>
-            </w:r>
-            <w:r>
-              <w:rPr>
-                <w:rFonts w:eastAsia="Arial" w:cs="Arial" w:ascii="Arial" w:hAnsi="Arial"/>
-                <w:i/>
-                <w:iCs/>
-                <w:color w:themeColor="text1" w:val="000000"/>
-                <w:kern w:val="0"/>
-                <w:sz w:val="22"/>
-                <w:szCs w:val="22"/>
-                <w:lang w:val="en-PH" w:eastAsia="en-US" w:bidi="ar-SA"/>
-              </w:rPr>
-              <w:t>o</w:t>
-            </w:r>
-            <w:r>
-              <w:rPr>
-                <w:rFonts w:eastAsia="Arial" w:cs="Arial" w:ascii="Arial" w:hAnsi="Arial"/>
-                <w:i/>
-                <w:iCs/>
-                <w:color w:themeColor="text1" w:val="000000"/>
-                <w:kern w:val="0"/>
-                <w:sz w:val="22"/>
-                <w:szCs w:val="22"/>
-                <w:lang w:val="en-PH" w:eastAsia="en-US" w:bidi="ar-SA"/>
-              </w:rPr>
-              <w:t>r</w:t>
-            </w:r>
-            <w:r>
-              <w:rPr>
-                <w:rFonts w:eastAsia="Arial" w:cs="Arial" w:ascii="Arial" w:hAnsi="Arial"/>
-                <w:i/>
-                <w:iCs/>
-                <w:color w:themeColor="text1" w:val="000000"/>
-                <w:kern w:val="0"/>
-                <w:sz w:val="22"/>
-                <w:szCs w:val="22"/>
-                <w:lang w:val="en-PH" w:eastAsia="en-US" w:bidi="ar-SA"/>
-              </w:rPr>
-              <w:t>_</w:t>
-            </w:r>
-            <w:r>
-              <w:rPr>
-                <w:rFonts w:eastAsia="Arial" w:cs="Arial" w:ascii="Arial" w:hAnsi="Arial"/>
-                <w:i/>
-                <w:iCs/>
-                <w:color w:themeColor="text1" w:val="000000"/>
-                <w:kern w:val="0"/>
-                <w:sz w:val="22"/>
-                <w:szCs w:val="22"/>
-                <w:lang w:val="en-PH" w:eastAsia="en-US" w:bidi="ar-SA"/>
-              </w:rPr>
-              <w:t>p</w:t>
-            </w:r>
-            <w:r>
-              <w:rPr>
-                <w:rFonts w:eastAsia="Arial" w:cs="Arial" w:ascii="Arial" w:hAnsi="Arial"/>
-                <w:i/>
-                <w:iCs/>
-                <w:color w:themeColor="text1" w:val="000000"/>
-                <w:kern w:val="0"/>
-                <w:sz w:val="22"/>
-                <w:szCs w:val="22"/>
-                <w:lang w:val="en-PH" w:eastAsia="en-US" w:bidi="ar-SA"/>
-              </w:rPr>
-              <w:t>o</w:t>
-            </w:r>
-            <w:r>
-              <w:rPr>
-                <w:rFonts w:eastAsia="Arial" w:cs="Arial" w:ascii="Arial" w:hAnsi="Arial"/>
-                <w:i/>
-                <w:iCs/>
-                <w:color w:themeColor="text1" w:val="000000"/>
-                <w:kern w:val="0"/>
-                <w:sz w:val="22"/>
-                <w:szCs w:val="22"/>
-                <w:lang w:val="en-PH" w:eastAsia="en-US" w:bidi="ar-SA"/>
-              </w:rPr>
-              <w:t>s</w:t>
-            </w:r>
-            <w:r>
-              <w:rPr>
-                <w:rFonts w:eastAsia="Arial" w:cs="Arial" w:ascii="Arial" w:hAnsi="Arial"/>
-                <w:i/>
-                <w:iCs/>
-                <w:color w:themeColor="text1" w:val="000000"/>
-                <w:kern w:val="0"/>
-                <w:sz w:val="22"/>
-                <w:szCs w:val="22"/>
-                <w:lang w:val="en-PH" w:eastAsia="en-US" w:bidi="ar-SA"/>
-              </w:rPr>
-              <w:t>i</w:t>
-            </w:r>
-            <w:r>
-              <w:rPr>
-                <w:rFonts w:eastAsia="Arial" w:cs="Arial" w:ascii="Arial" w:hAnsi="Arial"/>
-                <w:i/>
-                <w:iCs/>
-                <w:color w:themeColor="text1" w:val="000000"/>
-                <w:kern w:val="0"/>
-                <w:sz w:val="22"/>
-                <w:szCs w:val="22"/>
-                <w:lang w:val="en-PH" w:eastAsia="en-US" w:bidi="ar-SA"/>
-              </w:rPr>
-              <w:t>t</w:t>
-            </w:r>
-            <w:r>
-              <w:rPr>
-                <w:rFonts w:eastAsia="Arial" w:cs="Arial" w:ascii="Arial" w:hAnsi="Arial"/>
-                <w:i/>
-                <w:iCs/>
-                <w:color w:themeColor="text1" w:val="000000"/>
-                <w:kern w:val="0"/>
-                <w:sz w:val="22"/>
-                <w:szCs w:val="22"/>
-                <w:lang w:val="en-PH" w:eastAsia="en-US" w:bidi="ar-SA"/>
-              </w:rPr>
-              <w:t>i</w:t>
-            </w:r>
-            <w:r>
-              <w:rPr>
-                <w:rFonts w:eastAsia="Arial" w:cs="Arial" w:ascii="Arial" w:hAnsi="Arial"/>
-                <w:i/>
-                <w:iCs/>
-                <w:color w:themeColor="text1" w:val="000000"/>
-                <w:kern w:val="0"/>
-                <w:sz w:val="22"/>
-                <w:szCs w:val="22"/>
-                <w:lang w:val="en-PH" w:eastAsia="en-US" w:bidi="ar-SA"/>
-              </w:rPr>
-              <w:t>o</w:t>
-            </w:r>
-            <w:r>
-              <w:rPr>
-                <w:rFonts w:eastAsia="Arial" w:cs="Arial" w:ascii="Arial" w:hAnsi="Arial"/>
-                <w:i/>
-                <w:iCs/>
-                <w:color w:themeColor="text1" w:val="000000"/>
-                <w:kern w:val="0"/>
-                <w:sz w:val="22"/>
-                <w:szCs w:val="22"/>
-                <w:lang w:val="en-PH" w:eastAsia="en-US" w:bidi="ar-SA"/>
-              </w:rPr>
-              <w:t>n</w:t>
-            </w:r>
-            <w:r>
-              <w:rPr>
-                <w:rFonts w:eastAsia="Arial" w:cs="Arial" w:ascii="Arial" w:hAnsi="Arial"/>
-                <w:i/>
-                <w:iCs/>
-                <w:color w:themeColor="text1" w:val="000000"/>
-                <w:kern w:val="0"/>
-                <w:sz w:val="22"/>
-                <w:szCs w:val="22"/>
-                <w:lang w:val="en-PH" w:eastAsia="en-US" w:bidi="ar-SA"/>
-              </w:rPr>
-              <w:t>_</w:t>
-            </w:r>
-            <w:r>
-              <w:rPr>
-                <w:rFonts w:eastAsia="Arial" w:cs="Arial" w:ascii="Arial" w:hAnsi="Arial"/>
-                <w:i/>
-                <w:iCs/>
-                <w:color w:themeColor="text1" w:val="000000"/>
-                <w:kern w:val="0"/>
-                <w:sz w:val="22"/>
-                <w:szCs w:val="22"/>
-                <w:lang w:val="en-PH" w:eastAsia="en-US" w:bidi="ar-SA"/>
-              </w:rPr>
-              <w:t>d</w:t>
-            </w:r>
-            <w:r>
-              <w:rPr>
-                <w:rFonts w:eastAsia="Arial" w:cs="Arial" w:ascii="Arial" w:hAnsi="Arial"/>
-                <w:i/>
-                <w:iCs/>
-                <w:color w:themeColor="text1" w:val="000000"/>
-                <w:kern w:val="0"/>
-                <w:sz w:val="22"/>
-                <w:szCs w:val="22"/>
-                <w:lang w:val="en-PH" w:eastAsia="en-US" w:bidi="ar-SA"/>
-              </w:rPr>
-              <w:t>e</w:t>
-            </w:r>
-            <w:r>
-              <w:rPr>
-                <w:rFonts w:eastAsia="Arial" w:cs="Arial" w:ascii="Arial" w:hAnsi="Arial"/>
-                <w:i/>
-                <w:iCs/>
-                <w:color w:themeColor="text1" w:val="000000"/>
-                <w:kern w:val="0"/>
-                <w:sz w:val="22"/>
-                <w:szCs w:val="22"/>
-                <w:lang w:val="en-PH" w:eastAsia="en-US" w:bidi="ar-SA"/>
-              </w:rPr>
-              <w:t>s</w:t>
-            </w:r>
-            <w:r>
-              <w:rPr>
-                <w:rFonts w:eastAsia="Arial" w:cs="Arial" w:ascii="Arial" w:hAnsi="Arial"/>
-                <w:i/>
-                <w:iCs/>
-                <w:color w:themeColor="text1" w:val="000000"/>
-                <w:kern w:val="0"/>
-                <w:sz w:val="22"/>
-                <w:szCs w:val="22"/>
-                <w:lang w:val="en-PH" w:eastAsia="en-US" w:bidi="ar-SA"/>
-              </w:rPr>
-              <w:t>i</w:t>
-            </w:r>
-            <w:r>
-              <w:rPr>
-                <w:rFonts w:eastAsia="Arial" w:cs="Arial" w:ascii="Arial" w:hAnsi="Arial"/>
-                <w:i/>
-                <w:iCs/>
-                <w:color w:themeColor="text1" w:val="000000"/>
-                <w:kern w:val="0"/>
-                <w:sz w:val="22"/>
-                <w:szCs w:val="22"/>
-                <w:lang w:val="en-PH" w:eastAsia="en-US" w:bidi="ar-SA"/>
-              </w:rPr>
-              <w:t>g</w:t>
-            </w:r>
-            <w:r>
-              <w:rPr>
-                <w:rFonts w:eastAsia="Arial" w:cs="Arial" w:ascii="Arial" w:hAnsi="Arial"/>
-                <w:i/>
-                <w:iCs/>
-                <w:color w:themeColor="text1" w:val="000000"/>
-                <w:kern w:val="0"/>
-                <w:sz w:val="22"/>
-                <w:szCs w:val="22"/>
-                <w:lang w:val="en-PH" w:eastAsia="en-US" w:bidi="ar-SA"/>
-              </w:rPr>
-              <w:t>n</w:t>
-            </w:r>
-            <w:r>
-              <w:rPr>
-                <w:rFonts w:eastAsia="Arial" w:cs="Arial" w:ascii="Arial" w:hAnsi="Arial"/>
-                <w:i/>
-                <w:iCs/>
-                <w:color w:themeColor="text1" w:val="000000"/>
-                <w:kern w:val="0"/>
-                <w:sz w:val="22"/>
-                <w:szCs w:val="22"/>
-                <w:lang w:val="en-PH" w:eastAsia="en-US" w:bidi="ar-SA"/>
-              </w:rPr>
-              <w:t>a</w:t>
-            </w:r>
-            <w:r>
-              <w:rPr>
-                <w:rFonts w:eastAsia="Arial" w:cs="Arial" w:ascii="Arial" w:hAnsi="Arial"/>
-                <w:i/>
-                <w:iCs/>
-                <w:color w:themeColor="text1" w:val="000000"/>
-                <w:kern w:val="0"/>
-                <w:sz w:val="22"/>
-                <w:szCs w:val="22"/>
-                <w:lang w:val="en-PH" w:eastAsia="en-US" w:bidi="ar-SA"/>
-              </w:rPr>
-              <w:t>t</w:t>
-            </w:r>
-            <w:r>
-              <w:rPr>
-                <w:rFonts w:eastAsia="Arial" w:cs="Arial" w:ascii="Arial" w:hAnsi="Arial"/>
-                <w:i/>
-                <w:iCs/>
-                <w:color w:themeColor="text1" w:val="000000"/>
-                <w:kern w:val="0"/>
-                <w:sz w:val="22"/>
-                <w:szCs w:val="22"/>
-                <w:lang w:val="en-PH" w:eastAsia="en-US" w:bidi="ar-SA"/>
-              </w:rPr>
-              <w:t>i</w:t>
-            </w:r>
-            <w:r>
-              <w:rPr>
-                <w:rFonts w:eastAsia="Arial" w:cs="Arial" w:ascii="Arial" w:hAnsi="Arial"/>
-                <w:i/>
-                <w:iCs/>
-                <w:color w:themeColor="text1" w:val="000000"/>
-                <w:kern w:val="0"/>
-                <w:sz w:val="22"/>
-                <w:szCs w:val="22"/>
-                <w:lang w:val="en-PH" w:eastAsia="en-US" w:bidi="ar-SA"/>
-              </w:rPr>
-              <w:t>o</w:t>
-            </w:r>
-            <w:r>
-              <w:rPr>
-                <w:rFonts w:eastAsia="Arial" w:cs="Arial" w:ascii="Arial" w:hAnsi="Arial"/>
-                <w:i/>
-                <w:iCs/>
-                <w:color w:themeColor="text1" w:val="000000"/>
-                <w:kern w:val="0"/>
-                <w:sz w:val="22"/>
-                <w:szCs w:val="22"/>
-                <w:lang w:val="en-PH" w:eastAsia="en-US" w:bidi="ar-SA"/>
-              </w:rPr>
-              <w:t>n</w:t>
-            </w:r>
-            <w:r>
-              <w:rPr>
-                <w:rFonts w:eastAsia="Arial" w:cs="Arial" w:ascii="Arial" w:hAnsi="Arial"/>
-                <w:i/>
-                <w:iCs/>
-                <w:color w:themeColor="text1" w:val="000000"/>
-                <w:kern w:val="0"/>
-                <w:sz w:val="22"/>
-                <w:szCs w:val="22"/>
-                <w:lang w:val="en-PH" w:eastAsia="en-US" w:bidi="ar-SA"/>
-              </w:rPr>
-              <w:t>}</w:t>
-            </w:r>
-            <w:r>
-              <w:rPr>
-                <w:rFonts w:eastAsia="Arial" w:cs="Arial" w:ascii="Arial" w:hAnsi="Arial"/>
-                <w:i/>
-                <w:iCs/>
-                <w:color w:themeColor="text1" w:val="000000"/>
-                <w:kern w:val="0"/>
-                <w:sz w:val="22"/>
-                <w:szCs w:val="22"/>
-                <w:lang w:val="en-PH" w:eastAsia="en-US" w:bidi="ar-SA"/>
-              </w:rPr>
-              <w:t>}</w:t>
+              <w:t>{{proprietor_position_designation}}</w:t>
             </w:r>
           </w:p>
           <w:p>
@@ -3189,241 +2219,7 @@
                 <w:szCs w:val="22"/>
                 <w:lang w:val="en-PH" w:eastAsia="en-US" w:bidi="ar-SA"/>
               </w:rPr>
-              <w:t>{</w:t>
-            </w:r>
-            <w:r>
-              <w:rPr>
-                <w:rFonts w:eastAsia="Arial" w:cs="Arial" w:ascii="Arial" w:hAnsi="Arial"/>
-                <w:i/>
-                <w:iCs/>
-                <w:color w:themeColor="text1" w:val="000000"/>
-                <w:kern w:val="0"/>
-                <w:sz w:val="22"/>
-                <w:szCs w:val="22"/>
-                <w:lang w:val="en-PH" w:eastAsia="en-US" w:bidi="ar-SA"/>
-              </w:rPr>
-              <w:t>{</w:t>
-            </w:r>
-            <w:r>
-              <w:rPr>
-                <w:rFonts w:eastAsia="Arial" w:cs="Arial" w:ascii="Arial" w:hAnsi="Arial"/>
-                <w:i/>
-                <w:iCs/>
-                <w:color w:themeColor="text1" w:val="000000"/>
-                <w:kern w:val="0"/>
-                <w:sz w:val="22"/>
-                <w:szCs w:val="22"/>
-                <w:lang w:val="en-PH" w:eastAsia="en-US" w:bidi="ar-SA"/>
-              </w:rPr>
-              <w:t>p</w:t>
-            </w:r>
-            <w:r>
-              <w:rPr>
-                <w:rFonts w:eastAsia="Arial" w:cs="Arial" w:ascii="Arial" w:hAnsi="Arial"/>
-                <w:i/>
-                <w:iCs/>
-                <w:color w:themeColor="text1" w:val="000000"/>
-                <w:kern w:val="0"/>
-                <w:sz w:val="22"/>
-                <w:szCs w:val="22"/>
-                <w:lang w:val="en-PH" w:eastAsia="en-US" w:bidi="ar-SA"/>
-              </w:rPr>
-              <w:t>r</w:t>
-            </w:r>
-            <w:r>
-              <w:rPr>
-                <w:rFonts w:eastAsia="Arial" w:cs="Arial" w:ascii="Arial" w:hAnsi="Arial"/>
-                <w:i/>
-                <w:iCs/>
-                <w:color w:themeColor="text1" w:val="000000"/>
-                <w:kern w:val="0"/>
-                <w:sz w:val="22"/>
-                <w:szCs w:val="22"/>
-                <w:lang w:val="en-PH" w:eastAsia="en-US" w:bidi="ar-SA"/>
-              </w:rPr>
-              <w:t>o</w:t>
-            </w:r>
-            <w:r>
-              <w:rPr>
-                <w:rFonts w:eastAsia="Arial" w:cs="Arial" w:ascii="Arial" w:hAnsi="Arial"/>
-                <w:i/>
-                <w:iCs/>
-                <w:color w:themeColor="text1" w:val="000000"/>
-                <w:kern w:val="0"/>
-                <w:sz w:val="22"/>
-                <w:szCs w:val="22"/>
-                <w:lang w:val="en-PH" w:eastAsia="en-US" w:bidi="ar-SA"/>
-              </w:rPr>
-              <w:t>p</w:t>
-            </w:r>
-            <w:r>
-              <w:rPr>
-                <w:rFonts w:eastAsia="Arial" w:cs="Arial" w:ascii="Arial" w:hAnsi="Arial"/>
-                <w:i/>
-                <w:iCs/>
-                <w:color w:themeColor="text1" w:val="000000"/>
-                <w:kern w:val="0"/>
-                <w:sz w:val="22"/>
-                <w:szCs w:val="22"/>
-                <w:lang w:val="en-PH" w:eastAsia="en-US" w:bidi="ar-SA"/>
-              </w:rPr>
-              <w:t>r</w:t>
-            </w:r>
-            <w:r>
-              <w:rPr>
-                <w:rFonts w:eastAsia="Arial" w:cs="Arial" w:ascii="Arial" w:hAnsi="Arial"/>
-                <w:i/>
-                <w:iCs/>
-                <w:color w:themeColor="text1" w:val="000000"/>
-                <w:kern w:val="0"/>
-                <w:sz w:val="22"/>
-                <w:szCs w:val="22"/>
-                <w:lang w:val="en-PH" w:eastAsia="en-US" w:bidi="ar-SA"/>
-              </w:rPr>
-              <w:t>i</w:t>
-            </w:r>
-            <w:r>
-              <w:rPr>
-                <w:rFonts w:eastAsia="Arial" w:cs="Arial" w:ascii="Arial" w:hAnsi="Arial"/>
-                <w:i/>
-                <w:iCs/>
-                <w:color w:themeColor="text1" w:val="000000"/>
-                <w:kern w:val="0"/>
-                <w:sz w:val="22"/>
-                <w:szCs w:val="22"/>
-                <w:lang w:val="en-PH" w:eastAsia="en-US" w:bidi="ar-SA"/>
-              </w:rPr>
-              <w:t>e</w:t>
-            </w:r>
-            <w:r>
-              <w:rPr>
-                <w:rFonts w:eastAsia="Arial" w:cs="Arial" w:ascii="Arial" w:hAnsi="Arial"/>
-                <w:i/>
-                <w:iCs/>
-                <w:color w:themeColor="text1" w:val="000000"/>
-                <w:kern w:val="0"/>
-                <w:sz w:val="22"/>
-                <w:szCs w:val="22"/>
-                <w:lang w:val="en-PH" w:eastAsia="en-US" w:bidi="ar-SA"/>
-              </w:rPr>
-              <w:t>t</w:t>
-            </w:r>
-            <w:r>
-              <w:rPr>
-                <w:rFonts w:eastAsia="Arial" w:cs="Arial" w:ascii="Arial" w:hAnsi="Arial"/>
-                <w:i/>
-                <w:iCs/>
-                <w:color w:themeColor="text1" w:val="000000"/>
-                <w:kern w:val="0"/>
-                <w:sz w:val="22"/>
-                <w:szCs w:val="22"/>
-                <w:lang w:val="en-PH" w:eastAsia="en-US" w:bidi="ar-SA"/>
-              </w:rPr>
-              <w:t>o</w:t>
-            </w:r>
-            <w:r>
-              <w:rPr>
-                <w:rFonts w:eastAsia="Arial" w:cs="Arial" w:ascii="Arial" w:hAnsi="Arial"/>
-                <w:i/>
-                <w:iCs/>
-                <w:color w:themeColor="text1" w:val="000000"/>
-                <w:kern w:val="0"/>
-                <w:sz w:val="22"/>
-                <w:szCs w:val="22"/>
-                <w:lang w:val="en-PH" w:eastAsia="en-US" w:bidi="ar-SA"/>
-              </w:rPr>
-              <w:t>r</w:t>
-            </w:r>
-            <w:r>
-              <w:rPr>
-                <w:rFonts w:eastAsia="Arial" w:cs="Arial" w:ascii="Arial" w:hAnsi="Arial"/>
-                <w:i/>
-                <w:iCs/>
-                <w:color w:themeColor="text1" w:val="000000"/>
-                <w:kern w:val="0"/>
-                <w:sz w:val="22"/>
-                <w:szCs w:val="22"/>
-                <w:lang w:val="en-PH" w:eastAsia="en-US" w:bidi="ar-SA"/>
-              </w:rPr>
-              <w:t>_</w:t>
-            </w:r>
-            <w:r>
-              <w:rPr>
-                <w:rFonts w:eastAsia="Arial" w:cs="Arial" w:ascii="Arial" w:hAnsi="Arial"/>
-                <w:i/>
-                <w:iCs/>
-                <w:color w:themeColor="text1" w:val="000000"/>
-                <w:kern w:val="0"/>
-                <w:sz w:val="22"/>
-                <w:szCs w:val="22"/>
-                <w:lang w:val="en-PH" w:eastAsia="en-US" w:bidi="ar-SA"/>
-              </w:rPr>
-              <w:t>d</w:t>
-            </w:r>
-            <w:r>
-              <w:rPr>
-                <w:rFonts w:eastAsia="Arial" w:cs="Arial" w:ascii="Arial" w:hAnsi="Arial"/>
-                <w:i/>
-                <w:iCs/>
-                <w:color w:themeColor="text1" w:val="000000"/>
-                <w:kern w:val="0"/>
-                <w:sz w:val="22"/>
-                <w:szCs w:val="22"/>
-                <w:lang w:val="en-PH" w:eastAsia="en-US" w:bidi="ar-SA"/>
-              </w:rPr>
-              <w:t>a</w:t>
-            </w:r>
-            <w:r>
-              <w:rPr>
-                <w:rFonts w:eastAsia="Arial" w:cs="Arial" w:ascii="Arial" w:hAnsi="Arial"/>
-                <w:i/>
-                <w:iCs/>
-                <w:color w:themeColor="text1" w:val="000000"/>
-                <w:kern w:val="0"/>
-                <w:sz w:val="22"/>
-                <w:szCs w:val="22"/>
-                <w:lang w:val="en-PH" w:eastAsia="en-US" w:bidi="ar-SA"/>
-              </w:rPr>
-              <w:t>t</w:t>
-            </w:r>
-            <w:r>
-              <w:rPr>
-                <w:rFonts w:eastAsia="Arial" w:cs="Arial" w:ascii="Arial" w:hAnsi="Arial"/>
-                <w:i/>
-                <w:iCs/>
-                <w:color w:themeColor="text1" w:val="000000"/>
-                <w:kern w:val="0"/>
-                <w:sz w:val="22"/>
-                <w:szCs w:val="22"/>
-                <w:lang w:val="en-PH" w:eastAsia="en-US" w:bidi="ar-SA"/>
-              </w:rPr>
-              <w:t>e</w:t>
-            </w:r>
-            <w:r>
-              <w:rPr>
-                <w:rFonts w:eastAsia="Arial" w:cs="Arial" w:ascii="Arial" w:hAnsi="Arial"/>
-                <w:i/>
-                <w:iCs/>
-                <w:color w:themeColor="text1" w:val="000000"/>
-                <w:kern w:val="0"/>
-                <w:sz w:val="22"/>
-                <w:szCs w:val="22"/>
-                <w:lang w:val="en-PH" w:eastAsia="en-US" w:bidi="ar-SA"/>
-              </w:rPr>
-              <w:t>}</w:t>
-            </w:r>
-            <w:r>
-              <w:rPr>
-                <w:rFonts w:eastAsia="Arial" w:cs="Arial" w:ascii="Arial" w:hAnsi="Arial"/>
-                <w:i/>
-                <w:iCs/>
-                <w:color w:themeColor="text1" w:val="000000"/>
-                <w:kern w:val="0"/>
-                <w:sz w:val="22"/>
-                <w:szCs w:val="22"/>
-                <w:lang w:val="en-PH" w:eastAsia="en-US" w:bidi="ar-SA"/>
-              </w:rPr>
-              <w:t>}</w:t>
+              <w:t>{{proprietor_date}}</w:t>
             </w:r>
           </w:p>
           <w:p>

</xml_diff>

<commit_message>
reviewed, fixes in placeholders and config
</commit_message>
<xml_diff>
--- a/public/docs/NGPA_Contract-Form.docx
+++ b/public/docs/NGPA_Contract-Form.docx
@@ -284,7 +284,15 @@
       </w:r>
       <w:r>
         <w:rPr/>
-        <w:t xml:space="preserve"> a company duly organized and existing under the laws of [city and country], with principal office at [insert address], hereinafter called “the Supplier/Contractor/Consultant”.  </w:t>
+        <w:t xml:space="preserve"> a company duly organized and existing under the laws of </w:t>
+      </w:r>
+      <w:r>
+        <w:rPr/>
+        <w:t>{{laws_city_country}}</w:t>
+      </w:r>
+      <w:r>
+        <w:rPr/>
+        <w:t xml:space="preserve">, with principal office at {{office_address}}, hereinafter called “the Supplier/Contractor/Consultant”.  </w:t>
       </w:r>
     </w:p>
     <w:p>

</xml_diff>